<commit_message>
Agrego CBU de Raquel
</commit_message>
<xml_diff>
--- a/Melany - IAFO/Historia Sagrada y Tutoria/PAIR 4TO HISTORIA SAGRADA2026.docx
+++ b/Melany - IAFO/Historia Sagrada y Tutoria/PAIR 4TO HISTORIA SAGRADA2026.docx
@@ -30,83 +30,89 @@
       <w:pPr>
         <w:jc w:val="center"/>
         <w:rPr>
-          <w:rFonts w:ascii="Adventista" w:hAnsi="Adventista" w:cs="Times New Roman"/>
+          <w:rFonts w:ascii="Arial" w:hAnsi="Arial" w:cs="Arial"/>
           <w:noProof/>
           <w:color w:val="153D63" w:themeColor="text2" w:themeTint="E6"/>
-          <w:sz w:val="18"/>
-          <w:szCs w:val="18"/>
+          <w:sz w:val="48"/>
+          <w:szCs w:val="48"/>
           <w:u w:val="single"/>
           <w:lang w:val="es-ES"/>
         </w:rPr>
       </w:pPr>
       <w:r>
         <w:rPr>
-          <w:rFonts w:ascii="Adventista" w:hAnsi="Adventista" w:cs="Times New Roman"/>
+          <w:rFonts w:ascii="Arial" w:hAnsi="Arial" w:cs="Arial"/>
           <w:noProof/>
           <w:color w:val="153D63" w:themeColor="text2" w:themeTint="E6"/>
-          <w:sz w:val="18"/>
-          <w:szCs w:val="18"/>
+          <w:sz w:val="48"/>
+          <w:szCs w:val="48"/>
           <w:u w:val="single"/>
           <w:lang w:val="es-ES"/>
         </w:rPr>
-        <w:t>Plan de Apoyo a la Integración y Recuperación</w:t>
+        <w:t>PLAN DE APOYO A LA INTEGRACIÓN Y RECUPERACIÓN</w:t>
       </w:r>
     </w:p>
     <w:p>
       <w:pPr>
         <w:spacing w:after="0"/>
         <w:rPr>
-          <w:noProof/>
-          <w:sz w:val="20"/>
-          <w:szCs w:val="20"/>
-          <w:lang w:val="es-ES"/>
-        </w:rPr>
-      </w:pPr>
-      <w:r>
-        <w:rPr>
-          <w:noProof/>
-          <w:sz w:val="20"/>
-          <w:szCs w:val="20"/>
+          <w:rFonts w:ascii="Arial" w:hAnsi="Arial" w:cs="Arial"/>
+          <w:noProof/>
+          <w:sz w:val="48"/>
+          <w:szCs w:val="48"/>
+          <w:lang w:val="es-ES"/>
+        </w:rPr>
+      </w:pPr>
+      <w:r>
+        <w:rPr>
+          <w:rFonts w:ascii="Arial" w:hAnsi="Arial" w:cs="Arial"/>
+          <w:noProof/>
+          <w:sz w:val="48"/>
+          <w:szCs w:val="48"/>
           <w:u w:val="single"/>
           <w:lang w:val="es-ES"/>
         </w:rPr>
-        <w:t>Profesora:</w:t>
-      </w:r>
-      <w:r>
-        <w:rPr>
-          <w:noProof/>
-          <w:sz w:val="20"/>
-          <w:szCs w:val="20"/>
-          <w:lang w:val="es-ES"/>
-        </w:rPr>
-        <w:t xml:space="preserve"> Daniela Salvatierra</w:t>
+        <w:t>PROFESORA:</w:t>
+      </w:r>
+      <w:r>
+        <w:rPr>
+          <w:rFonts w:ascii="Arial" w:hAnsi="Arial" w:cs="Arial"/>
+          <w:noProof/>
+          <w:sz w:val="48"/>
+          <w:szCs w:val="48"/>
+          <w:lang w:val="es-ES"/>
+        </w:rPr>
+        <w:t xml:space="preserve"> DANIELA SALVATIERRA</w:t>
       </w:r>
     </w:p>
     <w:p>
       <w:pPr>
         <w:spacing w:after="0"/>
         <w:rPr>
-          <w:noProof/>
-          <w:sz w:val="20"/>
-          <w:szCs w:val="20"/>
-          <w:lang w:val="es-ES"/>
-        </w:rPr>
-      </w:pPr>
-      <w:r>
-        <w:rPr>
-          <w:noProof/>
-          <w:sz w:val="20"/>
-          <w:szCs w:val="20"/>
+          <w:rFonts w:ascii="Arial" w:hAnsi="Arial" w:cs="Arial"/>
+          <w:noProof/>
+          <w:sz w:val="48"/>
+          <w:szCs w:val="48"/>
+          <w:lang w:val="es-ES"/>
+        </w:rPr>
+      </w:pPr>
+      <w:r>
+        <w:rPr>
+          <w:rFonts w:ascii="Arial" w:hAnsi="Arial" w:cs="Arial"/>
+          <w:noProof/>
+          <w:sz w:val="48"/>
+          <w:szCs w:val="48"/>
           <w:u w:val="single"/>
           <w:lang w:val="es-ES"/>
         </w:rPr>
-        <w:t>Materia:</w:t>
-      </w:r>
-      <w:r>
-        <w:rPr>
-          <w:noProof/>
-          <w:sz w:val="20"/>
-          <w:szCs w:val="20"/>
+        <w:t>MATERIA:</w:t>
+      </w:r>
+      <w:r>
+        <w:rPr>
+          <w:rFonts w:ascii="Arial" w:hAnsi="Arial" w:cs="Arial"/>
+          <w:noProof/>
+          <w:sz w:val="48"/>
+          <w:szCs w:val="48"/>
           <w:lang w:val="es-ES"/>
         </w:rPr>
         <w:t xml:space="preserve"> HISTORIA SAGRADA</w:t>
@@ -116,104 +122,85 @@
       <w:pPr>
         <w:spacing w:after="0"/>
         <w:rPr>
-          <w:noProof/>
-          <w:sz w:val="20"/>
-          <w:szCs w:val="20"/>
-          <w:lang w:val="es-ES"/>
-        </w:rPr>
-      </w:pPr>
-      <w:r>
-        <w:rPr>
-          <w:noProof/>
-          <w:sz w:val="20"/>
-          <w:szCs w:val="20"/>
+          <w:rFonts w:ascii="Arial" w:hAnsi="Arial" w:cs="Arial"/>
+          <w:noProof/>
+          <w:sz w:val="48"/>
+          <w:szCs w:val="48"/>
+          <w:lang w:val="es-ES"/>
+        </w:rPr>
+      </w:pPr>
+      <w:r>
+        <w:rPr>
+          <w:rFonts w:ascii="Arial" w:hAnsi="Arial" w:cs="Arial"/>
+          <w:noProof/>
+          <w:sz w:val="48"/>
+          <w:szCs w:val="48"/>
           <w:u w:val="single"/>
           <w:lang w:val="es-ES"/>
         </w:rPr>
-        <w:t>Curso:</w:t>
-      </w:r>
-      <w:r>
-        <w:rPr>
-          <w:noProof/>
-          <w:sz w:val="20"/>
-          <w:szCs w:val="20"/>
-          <w:lang w:val="es-ES"/>
-        </w:rPr>
-        <w:t xml:space="preserve"> </w:t>
-      </w:r>
-      <w:r>
-        <w:rPr>
-          <w:noProof/>
-          <w:sz w:val="20"/>
-          <w:szCs w:val="20"/>
-          <w:lang w:val="es-ES"/>
-        </w:rPr>
-        <w:t>4</w:t>
-      </w:r>
-      <w:r>
-        <w:rPr>
-          <w:noProof/>
-          <w:sz w:val="20"/>
-          <w:szCs w:val="20"/>
-          <w:lang w:val="es-ES"/>
-        </w:rPr>
-        <w:t>° Año “B”</w:t>
+        <w:t>CURSO:</w:t>
+      </w:r>
+      <w:r>
+        <w:rPr>
+          <w:rFonts w:ascii="Arial" w:hAnsi="Arial" w:cs="Arial"/>
+          <w:noProof/>
+          <w:sz w:val="48"/>
+          <w:szCs w:val="48"/>
+          <w:lang w:val="es-ES"/>
+        </w:rPr>
+        <w:t xml:space="preserve"> 4° AÑO “B”</w:t>
       </w:r>
     </w:p>
     <w:p>
       <w:pPr>
         <w:spacing w:after="0"/>
         <w:rPr>
-          <w:noProof/>
-          <w:sz w:val="20"/>
-          <w:szCs w:val="20"/>
-          <w:lang w:val="es-ES"/>
-        </w:rPr>
-      </w:pPr>
-      <w:r>
-        <w:rPr>
-          <w:noProof/>
-          <w:sz w:val="20"/>
-          <w:szCs w:val="20"/>
+          <w:rFonts w:ascii="Arial" w:hAnsi="Arial" w:cs="Arial"/>
+          <w:noProof/>
+          <w:sz w:val="48"/>
+          <w:szCs w:val="48"/>
+          <w:lang w:val="es-ES"/>
+        </w:rPr>
+      </w:pPr>
+      <w:r>
+        <w:rPr>
+          <w:rFonts w:ascii="Arial" w:hAnsi="Arial" w:cs="Arial"/>
+          <w:noProof/>
+          <w:sz w:val="48"/>
+          <w:szCs w:val="48"/>
           <w:u w:val="single"/>
           <w:lang w:val="es-ES"/>
         </w:rPr>
-        <w:t>Ciclo Lectivo</w:t>
-      </w:r>
-      <w:r>
-        <w:rPr>
-          <w:noProof/>
-          <w:sz w:val="20"/>
-          <w:szCs w:val="20"/>
-          <w:lang w:val="es-ES"/>
-        </w:rPr>
-        <w:t>: 202</w:t>
-      </w:r>
-      <w:r>
-        <w:rPr>
-          <w:noProof/>
-          <w:sz w:val="20"/>
-          <w:szCs w:val="20"/>
-          <w:lang w:val="es-ES"/>
-        </w:rPr>
-        <w:t>6</w:t>
-      </w:r>
-    </w:p>
-    <w:p>
-      <w:pPr>
-        <w:rPr>
-          <w:noProof/>
-          <w:sz w:val="20"/>
-          <w:szCs w:val="20"/>
+        <w:t>CICLO LECTIVO</w:t>
+      </w:r>
+      <w:r>
+        <w:rPr>
+          <w:rFonts w:ascii="Arial" w:hAnsi="Arial" w:cs="Arial"/>
+          <w:noProof/>
+          <w:sz w:val="48"/>
+          <w:szCs w:val="48"/>
+          <w:lang w:val="es-ES"/>
+        </w:rPr>
+        <w:t>: 2026</w:t>
+      </w:r>
+    </w:p>
+    <w:p>
+      <w:pPr>
+        <w:rPr>
+          <w:rFonts w:ascii="Arial" w:hAnsi="Arial" w:cs="Arial"/>
+          <w:noProof/>
+          <w:sz w:val="48"/>
+          <w:szCs w:val="48"/>
           <w:u w:val="single"/>
           <w:lang w:val="es-ES"/>
         </w:rPr>
       </w:pPr>
       <w:r>
         <w:rPr>
-          <w:noProof/>
-          <w:sz w:val="20"/>
-          <w:szCs w:val="20"/>
+          <w:rFonts w:ascii="Arial" w:hAnsi="Arial" w:cs="Arial"/>
+          <w:noProof/>
+          <w:sz w:val="48"/>
+          <w:szCs w:val="48"/>
           <w:u w:val="single"/>
           <w:lang w:val="es-ES"/>
         </w:rPr>
@@ -228,65 +215,62 @@
           <w:numId w:val="1"/>
         </w:numPr>
         <w:rPr>
-          <w:noProof/>
-          <w:sz w:val="20"/>
-          <w:szCs w:val="20"/>
-          <w:lang w:val="es-ES"/>
-        </w:rPr>
-      </w:pPr>
-      <w:r>
-        <w:rPr>
-          <w:noProof/>
-          <w:sz w:val="20"/>
-          <w:szCs w:val="20"/>
-          <w:lang w:val="es-ES"/>
-        </w:rPr>
-        <w:t xml:space="preserve">Presentación de Carpeta completa y las evidencias de los Tabajos Realizados. </w:t>
-      </w:r>
-    </w:p>
-    <w:p>
-      <w:pPr>
-        <w:rPr>
-          <w:noProof/>
-          <w:sz w:val="20"/>
-          <w:szCs w:val="20"/>
-          <w:lang w:val="es-ES"/>
-        </w:rPr>
-      </w:pPr>
-      <w:r>
-        <w:rPr>
-          <w:noProof/>
-          <w:sz w:val="20"/>
-          <w:szCs w:val="20"/>
-          <w:lang w:val="es-ES"/>
-        </w:rPr>
-        <w:t xml:space="preserve">UNIDAD 1:  </w:t>
-      </w:r>
-      <w:r>
-        <w:rPr>
-          <w:noProof/>
-          <w:sz w:val="20"/>
-          <w:szCs w:val="20"/>
-          <w:lang w:val="es-ES"/>
-        </w:rPr>
-        <w:t>DIOS</w:t>
-      </w:r>
-    </w:p>
-    <w:p>
-      <w:pPr>
-        <w:rPr>
-          <w:noProof/>
-          <w:sz w:val="20"/>
-          <w:szCs w:val="20"/>
+          <w:rFonts w:ascii="Arial" w:hAnsi="Arial" w:cs="Arial"/>
+          <w:noProof/>
+          <w:sz w:val="48"/>
+          <w:szCs w:val="48"/>
+          <w:lang w:val="es-ES"/>
+        </w:rPr>
+      </w:pPr>
+      <w:r>
+        <w:rPr>
+          <w:rFonts w:ascii="Arial" w:hAnsi="Arial" w:cs="Arial"/>
+          <w:noProof/>
+          <w:sz w:val="48"/>
+          <w:szCs w:val="48"/>
+          <w:lang w:val="es-ES"/>
+        </w:rPr>
+        <w:t xml:space="preserve">PRESENTACIÓN DE CARPETA COMPLETA Y LAS EVIDENCIAS DE LOS TABAJOS REALIZADOS. </w:t>
+      </w:r>
+    </w:p>
+    <w:p>
+      <w:pPr>
+        <w:rPr>
+          <w:rFonts w:ascii="Arial" w:hAnsi="Arial" w:cs="Arial"/>
+          <w:noProof/>
+          <w:sz w:val="48"/>
+          <w:szCs w:val="48"/>
+          <w:lang w:val="es-ES"/>
+        </w:rPr>
+      </w:pPr>
+      <w:r>
+        <w:rPr>
+          <w:rFonts w:ascii="Arial" w:hAnsi="Arial" w:cs="Arial"/>
+          <w:noProof/>
+          <w:sz w:val="48"/>
+          <w:szCs w:val="48"/>
+          <w:lang w:val="es-ES"/>
+        </w:rPr>
+        <w:t>UNIDAD 1:  DIOS</w:t>
+      </w:r>
+    </w:p>
+    <w:p>
+      <w:pPr>
+        <w:rPr>
+          <w:rFonts w:ascii="Arial" w:hAnsi="Arial" w:cs="Arial"/>
+          <w:noProof/>
+          <w:sz w:val="48"/>
+          <w:szCs w:val="48"/>
           <w:u w:val="single"/>
           <w:lang w:val="es-ES"/>
         </w:rPr>
       </w:pPr>
       <w:r>
         <w:rPr>
-          <w:noProof/>
-          <w:sz w:val="20"/>
-          <w:szCs w:val="20"/>
+          <w:rFonts w:ascii="Arial" w:hAnsi="Arial" w:cs="Arial"/>
+          <w:noProof/>
+          <w:sz w:val="48"/>
+          <w:szCs w:val="48"/>
           <w:u w:val="single"/>
           <w:lang w:val="es-ES"/>
         </w:rPr>
@@ -301,38 +285,22 @@
           <w:numId w:val="1"/>
         </w:numPr>
         <w:rPr>
-          <w:noProof/>
-          <w:sz w:val="20"/>
-          <w:szCs w:val="20"/>
-          <w:lang w:val="es-ES"/>
-        </w:rPr>
-      </w:pPr>
-      <w:r>
-        <w:rPr>
-          <w:noProof/>
-          <w:sz w:val="20"/>
-          <w:szCs w:val="20"/>
-          <w:lang w:val="es-ES"/>
-        </w:rPr>
-        <w:t xml:space="preserve">Presenación de trabajos realizados durante el presente </w:t>
-      </w:r>
-      <w:r>
-        <w:rPr>
-          <w:noProof/>
-          <w:sz w:val="20"/>
-          <w:szCs w:val="20"/>
-          <w:lang w:val="es-ES"/>
-        </w:rPr>
-        <w:t>trimestra</w:t>
-      </w:r>
-      <w:r>
-        <w:rPr>
-          <w:noProof/>
-          <w:sz w:val="20"/>
-          <w:szCs w:val="20"/>
-          <w:lang w:val="es-ES"/>
-        </w:rPr>
-        <w:t>.</w:t>
+          <w:rFonts w:ascii="Arial" w:hAnsi="Arial" w:cs="Arial"/>
+          <w:noProof/>
+          <w:sz w:val="48"/>
+          <w:szCs w:val="48"/>
+          <w:lang w:val="es-ES"/>
+        </w:rPr>
+      </w:pPr>
+      <w:r>
+        <w:rPr>
+          <w:rFonts w:ascii="Arial" w:hAnsi="Arial" w:cs="Arial"/>
+          <w:noProof/>
+          <w:sz w:val="48"/>
+          <w:szCs w:val="48"/>
+          <w:lang w:val="es-ES"/>
+        </w:rPr>
+        <w:t>PRESENACIÓN DE TRABAJOS REALIZADOS DURANTE EL PRESENTE TRIMESTRA.</w:t>
       </w:r>
     </w:p>
     <w:p>
@@ -343,20 +311,22 @@
           <w:numId w:val="1"/>
         </w:numPr>
         <w:rPr>
-          <w:noProof/>
-          <w:sz w:val="20"/>
-          <w:szCs w:val="20"/>
-          <w:lang w:val="es-ES"/>
-        </w:rPr>
-      </w:pPr>
-      <w:r>
-        <w:rPr>
-          <w:noProof/>
-          <w:sz w:val="20"/>
-          <w:szCs w:val="20"/>
-          <w:lang w:val="es-ES"/>
-        </w:rPr>
-        <w:t>Carpeta Completa.</w:t>
+          <w:rFonts w:ascii="Arial" w:hAnsi="Arial" w:cs="Arial"/>
+          <w:noProof/>
+          <w:sz w:val="48"/>
+          <w:szCs w:val="48"/>
+          <w:lang w:val="es-ES"/>
+        </w:rPr>
+      </w:pPr>
+      <w:r>
+        <w:rPr>
+          <w:rFonts w:ascii="Arial" w:hAnsi="Arial" w:cs="Arial"/>
+          <w:noProof/>
+          <w:sz w:val="48"/>
+          <w:szCs w:val="48"/>
+          <w:lang w:val="es-ES"/>
+        </w:rPr>
+        <w:t>CARPETA COMPLETA.</w:t>
       </w:r>
     </w:p>
     <w:p>
@@ -367,29 +337,22 @@
           <w:numId w:val="1"/>
         </w:numPr>
         <w:rPr>
-          <w:noProof/>
-          <w:sz w:val="20"/>
-          <w:szCs w:val="20"/>
-          <w:lang w:val="es-ES"/>
-        </w:rPr>
-      </w:pPr>
-      <w:r>
-        <w:rPr>
-          <w:noProof/>
-          <w:sz w:val="20"/>
-          <w:szCs w:val="20"/>
-          <w:lang w:val="es-ES"/>
-        </w:rPr>
-        <w:t>Manejo de los contenidos priorizados en el PAIR</w:t>
-      </w:r>
-      <w:r>
-        <w:rPr>
-          <w:noProof/>
-          <w:sz w:val="20"/>
-          <w:szCs w:val="20"/>
-          <w:lang w:val="es-ES"/>
-        </w:rPr>
-        <w:t xml:space="preserve"> y otros trabajos realizados en el aula.</w:t>
+          <w:rFonts w:ascii="Arial" w:hAnsi="Arial" w:cs="Arial"/>
+          <w:noProof/>
+          <w:sz w:val="48"/>
+          <w:szCs w:val="48"/>
+          <w:lang w:val="es-ES"/>
+        </w:rPr>
+      </w:pPr>
+      <w:r>
+        <w:rPr>
+          <w:rFonts w:ascii="Arial" w:hAnsi="Arial" w:cs="Arial"/>
+          <w:noProof/>
+          <w:sz w:val="48"/>
+          <w:szCs w:val="48"/>
+          <w:lang w:val="es-ES"/>
+        </w:rPr>
+        <w:t>MANEJO DE LOS CONTENIDOS PRIORIZADOS EN EL PAIR Y OTROS TRABAJOS REALIZADOS EN EL AULA.</w:t>
       </w:r>
     </w:p>
     <w:p>
@@ -400,20 +363,22 @@
           <w:numId w:val="1"/>
         </w:numPr>
         <w:rPr>
-          <w:noProof/>
-          <w:sz w:val="20"/>
-          <w:szCs w:val="20"/>
-          <w:lang w:val="es-ES"/>
-        </w:rPr>
-      </w:pPr>
-      <w:r>
-        <w:rPr>
-          <w:noProof/>
-          <w:sz w:val="20"/>
-          <w:szCs w:val="20"/>
-          <w:lang w:val="es-ES"/>
-        </w:rPr>
-        <w:t>Argumentación y originalidad en la producción de textos y en la exposición oral.</w:t>
+          <w:rFonts w:ascii="Arial" w:hAnsi="Arial" w:cs="Arial"/>
+          <w:noProof/>
+          <w:sz w:val="48"/>
+          <w:szCs w:val="48"/>
+          <w:lang w:val="es-ES"/>
+        </w:rPr>
+      </w:pPr>
+      <w:r>
+        <w:rPr>
+          <w:rFonts w:ascii="Arial" w:hAnsi="Arial" w:cs="Arial"/>
+          <w:noProof/>
+          <w:sz w:val="48"/>
+          <w:szCs w:val="48"/>
+          <w:lang w:val="es-ES"/>
+        </w:rPr>
+        <w:t>ARGUMENTACIÓN Y ORIGINALIDAD EN LA PRODUCCIÓN DE TEXTOS Y EN LA EXPOSICIÓN ORAL.</w:t>
       </w:r>
     </w:p>
     <w:p>
@@ -424,141 +389,92 @@
           <w:numId w:val="1"/>
         </w:numPr>
         <w:rPr>
-          <w:noProof/>
-          <w:sz w:val="20"/>
-          <w:szCs w:val="20"/>
-          <w:lang w:val="es-ES"/>
-        </w:rPr>
-      </w:pPr>
-      <w:r>
-        <w:rPr>
-          <w:noProof/>
-          <w:sz w:val="20"/>
-          <w:szCs w:val="20"/>
-          <w:lang w:val="es-ES"/>
-        </w:rPr>
-        <w:t>Conocimientos básicos sobre la Estructura de la Biblia.</w:t>
-      </w:r>
-    </w:p>
-    <w:p>
-      <w:pPr>
-        <w:rPr>
-          <w:noProof/>
-          <w:sz w:val="20"/>
-          <w:szCs w:val="20"/>
+          <w:rFonts w:ascii="Arial" w:hAnsi="Arial" w:cs="Arial"/>
+          <w:noProof/>
+          <w:sz w:val="48"/>
+          <w:szCs w:val="48"/>
+          <w:lang w:val="es-ES"/>
+        </w:rPr>
+      </w:pPr>
+      <w:r>
+        <w:rPr>
+          <w:rFonts w:ascii="Arial" w:hAnsi="Arial" w:cs="Arial"/>
+          <w:noProof/>
+          <w:sz w:val="48"/>
+          <w:szCs w:val="48"/>
+          <w:lang w:val="es-ES"/>
+        </w:rPr>
+        <w:t>CONOCIMIENTOS BÁSICOS SOBRE LA ESTRUCTURA DE LA BIBLIA.</w:t>
+      </w:r>
+    </w:p>
+    <w:p>
+      <w:pPr>
+        <w:rPr>
+          <w:rFonts w:ascii="Arial" w:hAnsi="Arial" w:cs="Arial"/>
+          <w:noProof/>
+          <w:sz w:val="48"/>
+          <w:szCs w:val="48"/>
+          <w:lang w:val="es-ES"/>
+        </w:rPr>
+      </w:pPr>
+      <w:r>
+        <w:rPr>
+          <w:rFonts w:ascii="Arial" w:hAnsi="Arial" w:cs="Arial"/>
+          <w:noProof/>
+          <w:sz w:val="48"/>
+          <w:szCs w:val="48"/>
+          <w:lang w:val="es-ES"/>
+        </w:rPr>
+        <w:br w:type="page"/>
+      </w:r>
+    </w:p>
+    <w:p>
+      <w:pPr>
+        <w:rPr>
+          <w:rFonts w:ascii="Arial" w:hAnsi="Arial" w:cs="Arial"/>
+          <w:noProof/>
+          <w:sz w:val="48"/>
+          <w:szCs w:val="48"/>
           <w:u w:val="single"/>
           <w:lang w:val="es-ES"/>
         </w:rPr>
       </w:pPr>
       <w:r>
         <w:rPr>
-          <w:noProof/>
-          <w:sz w:val="20"/>
-          <w:szCs w:val="20"/>
+          <w:rFonts w:ascii="Arial" w:hAnsi="Arial" w:cs="Arial"/>
+          <w:noProof/>
+          <w:sz w:val="48"/>
+          <w:szCs w:val="48"/>
           <w:u w:val="single"/>
           <w:lang w:val="es-ES"/>
         </w:rPr>
+        <w:lastRenderedPageBreak/>
         <w:t>ACTIVIDADES:</w:t>
       </w:r>
     </w:p>
     <w:p>
       <w:pPr>
         <w:rPr>
+          <w:rFonts w:ascii="Arial" w:hAnsi="Arial" w:cs="Arial"/>
           <w:b/>
           <w:bCs/>
           <w:noProof/>
-          <w:sz w:val="22"/>
-          <w:szCs w:val="22"/>
-          <w:lang w:val="es-ES"/>
-        </w:rPr>
-      </w:pPr>
-      <w:r>
-        <w:rPr>
+          <w:sz w:val="48"/>
+          <w:szCs w:val="48"/>
+          <w:lang w:val="es-ES"/>
+        </w:rPr>
+      </w:pPr>
+      <w:r>
+        <w:rPr>
+          <w:rFonts w:ascii="Arial" w:hAnsi="Arial" w:cs="Arial"/>
           <w:b/>
           <w:bCs/>
           <w:noProof/>
-          <w:sz w:val="22"/>
-          <w:szCs w:val="22"/>
-          <w:lang w:val="es-ES"/>
-        </w:rPr>
-        <w:t>Fechas: 2</w:t>
-      </w:r>
-      <w:r>
-        <w:rPr>
-          <w:b/>
-          <w:bCs/>
-          <w:noProof/>
-          <w:sz w:val="22"/>
-          <w:szCs w:val="22"/>
-          <w:lang w:val="es-ES"/>
-        </w:rPr>
-        <w:t>8</w:t>
-      </w:r>
-      <w:r>
-        <w:rPr>
-          <w:b/>
-          <w:bCs/>
-          <w:noProof/>
-          <w:sz w:val="22"/>
-          <w:szCs w:val="22"/>
-          <w:lang w:val="es-ES"/>
-        </w:rPr>
-        <w:t xml:space="preserve">/05 – </w:t>
-      </w:r>
-      <w:r>
-        <w:rPr>
-          <w:b/>
-          <w:bCs/>
-          <w:noProof/>
-          <w:sz w:val="22"/>
-          <w:szCs w:val="22"/>
-          <w:lang w:val="es-ES"/>
-        </w:rPr>
-        <w:t>1</w:t>
-      </w:r>
-      <w:r>
-        <w:rPr>
-          <w:b/>
-          <w:bCs/>
-          <w:noProof/>
-          <w:sz w:val="22"/>
-          <w:szCs w:val="22"/>
-          <w:lang w:val="es-ES"/>
-        </w:rPr>
-        <w:t>/06</w:t>
-      </w:r>
-      <w:r>
-        <w:rPr>
-          <w:b/>
-          <w:bCs/>
-          <w:noProof/>
-          <w:sz w:val="22"/>
-          <w:szCs w:val="22"/>
-          <w:lang w:val="es-ES"/>
-        </w:rPr>
-        <w:t xml:space="preserve">   </w:t>
-      </w:r>
-      <w:r>
-        <w:rPr>
-          <w:b/>
-          <w:bCs/>
-          <w:noProof/>
-          <w:sz w:val="22"/>
-          <w:szCs w:val="22"/>
-          <w:lang w:val="es-ES"/>
-        </w:rPr>
-        <w:t>SE DESARROLLARÁ EN CLASES, LOS DÍAS SEÑALADOS.</w:t>
-      </w:r>
-      <w:r>
-        <w:rPr>
-          <w:b/>
-          <w:bCs/>
-          <w:noProof/>
-          <w:sz w:val="22"/>
-          <w:szCs w:val="22"/>
-          <w:lang w:val="es-ES"/>
-        </w:rPr>
-        <w:t xml:space="preserve">                            </w:t>
+          <w:sz w:val="48"/>
+          <w:szCs w:val="48"/>
+          <w:lang w:val="es-ES"/>
+        </w:rPr>
+        <w:t xml:space="preserve">FECHAS: 28/05 – 1/06   SE DESARROLLARÁ EN CLASES, LOS DÍAS SEÑALADOS.                            </w:t>
       </w:r>
     </w:p>
     <w:p>
@@ -569,37 +485,22 @@
           <w:numId w:val="2"/>
         </w:numPr>
         <w:rPr>
-          <w:noProof/>
-          <w:lang w:val="es-ES"/>
-        </w:rPr>
-      </w:pPr>
-      <w:r>
-        <w:rPr>
-          <w:noProof/>
-          <w:lang w:val="es-ES"/>
-        </w:rPr>
-        <w:t xml:space="preserve">Utilizando textos bíblicos como base, explica el concepto de </w:t>
-      </w:r>
-      <w:r>
-        <w:rPr>
-          <w:noProof/>
-          <w:lang w:val="es-ES"/>
-        </w:rPr>
-        <w:t>Deidad</w:t>
-      </w:r>
-      <w:r>
-        <w:rPr>
-          <w:noProof/>
-          <w:lang w:val="es-ES"/>
-        </w:rPr>
-        <w:t>.</w:t>
-      </w:r>
-      <w:r>
-        <w:rPr>
-          <w:noProof/>
-          <w:lang w:val="es-ES"/>
-        </w:rPr>
-        <w:t xml:space="preserve"> Desarrolla claramente tu idea.</w:t>
+          <w:rFonts w:ascii="Arial" w:hAnsi="Arial" w:cs="Arial"/>
+          <w:noProof/>
+          <w:sz w:val="48"/>
+          <w:szCs w:val="48"/>
+          <w:lang w:val="es-ES"/>
+        </w:rPr>
+      </w:pPr>
+      <w:r>
+        <w:rPr>
+          <w:rFonts w:ascii="Arial" w:hAnsi="Arial" w:cs="Arial"/>
+          <w:noProof/>
+          <w:sz w:val="48"/>
+          <w:szCs w:val="48"/>
+          <w:lang w:val="es-ES"/>
+        </w:rPr>
+        <w:t>UTILIZANDO TEXTOS BÍBLICOS COMO BASE, EXPLICA EL CONCEPTO DE DEIDAD. DESARROLLA CLARAMENTE TU IDEA.</w:t>
       </w:r>
     </w:p>
     <w:p>
@@ -610,23 +511,22 @@
           <w:numId w:val="2"/>
         </w:numPr>
         <w:rPr>
-          <w:noProof/>
-          <w:lang w:val="es-ES"/>
-        </w:rPr>
-      </w:pPr>
-      <w:r>
-        <w:rPr>
-          <w:noProof/>
-          <w:lang w:val="es-ES"/>
-        </w:rPr>
-        <w:t>Armar una red conceptual sobre los atributos divinos</w:t>
-      </w:r>
-      <w:r>
-        <w:rPr>
-          <w:noProof/>
-          <w:lang w:val="es-ES"/>
-        </w:rPr>
-        <w:t xml:space="preserve"> explicitando cada uno de ellos.</w:t>
+          <w:rFonts w:ascii="Arial" w:hAnsi="Arial" w:cs="Arial"/>
+          <w:noProof/>
+          <w:sz w:val="48"/>
+          <w:szCs w:val="48"/>
+          <w:lang w:val="es-ES"/>
+        </w:rPr>
+      </w:pPr>
+      <w:r>
+        <w:rPr>
+          <w:rFonts w:ascii="Arial" w:hAnsi="Arial" w:cs="Arial"/>
+          <w:noProof/>
+          <w:sz w:val="48"/>
+          <w:szCs w:val="48"/>
+          <w:lang w:val="es-ES"/>
+        </w:rPr>
+        <w:t>ARMA UNA INFOGRAFÍA DE LA TRINIDAD DONDE SE VEA EL ROL DE CADA PERSONA. INCLUYE DATOS CARACTERÍSTICAS DE CADA UNA DE ELLAS.</w:t>
       </w:r>
     </w:p>
     <w:p>
@@ -637,30 +537,555 @@
           <w:numId w:val="2"/>
         </w:numPr>
         <w:rPr>
-          <w:noProof/>
-          <w:lang w:val="es-ES"/>
-        </w:rPr>
-      </w:pPr>
-      <w:r>
-        <w:rPr>
-          <w:noProof/>
-          <w:lang w:val="es-ES"/>
-        </w:rPr>
-        <w:t>Arma un</w:t>
-      </w:r>
-      <w:r>
-        <w:rPr>
-          <w:noProof/>
-          <w:lang w:val="es-ES"/>
-        </w:rPr>
-        <w:t>a INFOGRAFÍA</w:t>
-      </w:r>
-      <w:r>
-        <w:rPr>
-          <w:noProof/>
-          <w:lang w:val="es-ES"/>
-        </w:rPr>
-        <w:t xml:space="preserve"> de la Trinidad donde se vea el rol de cada persona. Incluye datos características de cada una de ellas.</w:t>
+          <w:rFonts w:ascii="Arial" w:hAnsi="Arial" w:cs="Arial"/>
+          <w:noProof/>
+          <w:sz w:val="48"/>
+          <w:szCs w:val="48"/>
+          <w:lang w:val="es-ES"/>
+        </w:rPr>
+      </w:pPr>
+      <w:r>
+        <w:rPr>
+          <w:rFonts w:ascii="Arial" w:hAnsi="Arial" w:cs="Arial"/>
+          <w:noProof/>
+          <w:sz w:val="48"/>
+          <w:szCs w:val="48"/>
+          <w:lang w:val="es-ES"/>
+        </w:rPr>
+        <w:t xml:space="preserve">DE LAS SIGUIENTES PARÁBOLAS, ¿EN CUÁL PIENSAS QUE SE VE CLARAMENTE EL ROL DEL ESPÍRITU SANTO? </w:t>
+      </w:r>
+      <w:r>
+        <w:rPr>
+          <w:rFonts w:ascii="Arial" w:hAnsi="Arial" w:cs="Arial"/>
+          <w:b/>
+          <w:bCs/>
+          <w:noProof/>
+          <w:sz w:val="48"/>
+          <w:szCs w:val="48"/>
+          <w:lang w:val="es-ES"/>
+        </w:rPr>
+        <w:t>JUSTIFICA</w:t>
+      </w:r>
+      <w:r>
+        <w:rPr>
+          <w:rFonts w:ascii="Arial" w:hAnsi="Arial" w:cs="Arial"/>
+          <w:noProof/>
+          <w:sz w:val="48"/>
+          <w:szCs w:val="48"/>
+          <w:lang w:val="es-ES"/>
+        </w:rPr>
+        <w:t>.</w:t>
+      </w:r>
+    </w:p>
+    <w:p>
+      <w:pPr>
+        <w:pStyle w:val="Prrafodelista"/>
+        <w:rPr>
+          <w:rFonts w:ascii="Arial" w:hAnsi="Arial" w:cs="Arial"/>
+          <w:noProof/>
+          <w:sz w:val="48"/>
+          <w:szCs w:val="48"/>
+          <w:lang w:val="es-ES"/>
+        </w:rPr>
+      </w:pPr>
+    </w:p>
+    <w:p>
+      <w:pPr>
+        <w:pStyle w:val="Prrafodelista"/>
+        <w:rPr>
+          <w:rFonts w:ascii="Arial" w:hAnsi="Arial" w:cs="Arial"/>
+          <w:noProof/>
+          <w:sz w:val="48"/>
+          <w:szCs w:val="48"/>
+          <w:lang w:val="es-ES"/>
+        </w:rPr>
+      </w:pPr>
+      <w:r>
+        <w:rPr>
+          <w:rFonts w:ascii="Arial" w:hAnsi="Arial" w:cs="Arial"/>
+          <w:noProof/>
+          <w:sz w:val="48"/>
+          <w:szCs w:val="48"/>
+          <w:lang w:val="es-ES"/>
+        </w:rPr>
+        <mc:AlternateContent>
+          <mc:Choice Requires="wps">
+            <w:drawing>
+              <wp:anchor distT="0" distB="0" distL="114300" distR="114300" simplePos="0" relativeHeight="251659264" behindDoc="0" locked="0" layoutInCell="1" allowOverlap="1" wp14:anchorId="15E830C7" wp14:editId="52D9C0DC">
+                <wp:simplePos x="0" y="0"/>
+                <wp:positionH relativeFrom="column">
+                  <wp:posOffset>122224</wp:posOffset>
+                </wp:positionH>
+                <wp:positionV relativeFrom="paragraph">
+                  <wp:posOffset>26670</wp:posOffset>
+                </wp:positionV>
+                <wp:extent cx="278296" cy="286247"/>
+                <wp:effectExtent l="0" t="0" r="26670" b="19050"/>
+                <wp:wrapNone/>
+                <wp:docPr id="74202551" name="Marco 1"/>
+                <wp:cNvGraphicFramePr/>
+                <a:graphic xmlns:a="http://schemas.openxmlformats.org/drawingml/2006/main">
+                  <a:graphicData uri="http://schemas.microsoft.com/office/word/2010/wordprocessingShape">
+                    <wps:wsp>
+                      <wps:cNvSpPr/>
+                      <wps:spPr>
+                        <a:xfrm>
+                          <a:off x="0" y="0"/>
+                          <a:ext cx="278296" cy="286247"/>
+                        </a:xfrm>
+                        <a:prstGeom prst="frame">
+                          <a:avLst/>
+                        </a:prstGeom>
+                      </wps:spPr>
+                      <wps:style>
+                        <a:lnRef idx="2">
+                          <a:schemeClr val="dk1">
+                            <a:shade val="15000"/>
+                          </a:schemeClr>
+                        </a:lnRef>
+                        <a:fillRef idx="1">
+                          <a:schemeClr val="dk1"/>
+                        </a:fillRef>
+                        <a:effectRef idx="0">
+                          <a:schemeClr val="dk1"/>
+                        </a:effectRef>
+                        <a:fontRef idx="minor">
+                          <a:schemeClr val="lt1"/>
+                        </a:fontRef>
+                      </wps:style>
+                      <wps:bodyPr rot="0" spcFirstLastPara="0" vertOverflow="overflow" horzOverflow="overflow" vert="horz" wrap="square" lIns="91440" tIns="45720" rIns="91440" bIns="45720" numCol="1" spcCol="0" rtlCol="0" fromWordArt="0" anchor="ctr" anchorCtr="0" forceAA="0" compatLnSpc="1">
+                        <a:prstTxWarp prst="textNoShape">
+                          <a:avLst/>
+                        </a:prstTxWarp>
+                        <a:noAutofit/>
+                      </wps:bodyPr>
+                    </wps:wsp>
+                  </a:graphicData>
+                </a:graphic>
+              </wp:anchor>
+            </w:drawing>
+          </mc:Choice>
+          <mc:Fallback>
+            <w:pict>
+              <v:shape w14:anchorId="2BC97BD1" id="Marco 1" o:spid="_x0000_s1026" style="position:absolute;margin-left:9.6pt;margin-top:2.1pt;width:21.9pt;height:22.55pt;z-index:251659264;visibility:visible;mso-wrap-style:square;mso-wrap-distance-left:9pt;mso-wrap-distance-top:0;mso-wrap-distance-right:9pt;mso-wrap-distance-bottom:0;mso-position-horizontal:absolute;mso-position-horizontal-relative:text;mso-position-vertical:absolute;mso-position-vertical-relative:text;v-text-anchor:middle" coordsize="278296,286247" o:gfxdata="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" path="m,l278296,r,286247l,286247,,xm34787,34787r,216673l243509,251460r,-216673l34787,34787xe" fillcolor="black [3200]" strokecolor="black [480]" strokeweight="1.5pt">
+                <v:stroke joinstyle="miter"/>
+                <v:path arrowok="t" o:connecttype="custom" o:connectlocs="0,0;278296,0;278296,286247;0,286247;0,0;34787,34787;34787,251460;243509,251460;243509,34787;34787,34787" o:connectangles="0,0,0,0,0,0,0,0,0,0"/>
+              </v:shape>
+            </w:pict>
+          </mc:Fallback>
+        </mc:AlternateContent>
+      </w:r>
+      <w:r>
+        <w:rPr>
+          <w:rFonts w:ascii="Arial" w:hAnsi="Arial" w:cs="Arial"/>
+          <w:noProof/>
+          <w:sz w:val="48"/>
+          <w:szCs w:val="48"/>
+          <w:lang w:val="es-ES"/>
+        </w:rPr>
+        <w:t>EL SEMBRADOR (</w:t>
+      </w:r>
+      <w:r>
+        <w:rPr>
+          <w:rFonts w:ascii="Arial" w:hAnsi="Arial" w:cs="Arial"/>
+          <w:noProof/>
+          <w:sz w:val="44"/>
+          <w:szCs w:val="44"/>
+          <w:lang w:val="es-ES"/>
+        </w:rPr>
+        <w:t>LUCAS 8:4-15</w:t>
+      </w:r>
+      <w:r>
+        <w:rPr>
+          <w:rFonts w:ascii="Arial" w:hAnsi="Arial" w:cs="Arial"/>
+          <w:noProof/>
+          <w:sz w:val="48"/>
+          <w:szCs w:val="48"/>
+          <w:lang w:val="es-ES"/>
+        </w:rPr>
+        <w:t>)</w:t>
+      </w:r>
+    </w:p>
+    <w:p>
+      <w:pPr>
+        <w:pStyle w:val="Prrafodelista"/>
+        <w:rPr>
+          <w:rFonts w:ascii="Arial" w:hAnsi="Arial" w:cs="Arial"/>
+          <w:noProof/>
+          <w:sz w:val="48"/>
+          <w:szCs w:val="48"/>
+          <w:lang w:val="es-ES"/>
+        </w:rPr>
+      </w:pPr>
+      <w:r>
+        <w:rPr>
+          <w:rFonts w:ascii="Arial" w:hAnsi="Arial" w:cs="Arial"/>
+          <w:noProof/>
+          <w:sz w:val="48"/>
+          <w:szCs w:val="48"/>
+          <w:lang w:val="es-ES"/>
+        </w:rPr>
+        <mc:AlternateContent>
+          <mc:Choice Requires="wps">
+            <w:drawing>
+              <wp:anchor distT="0" distB="0" distL="114300" distR="114300" simplePos="0" relativeHeight="251661312" behindDoc="0" locked="0" layoutInCell="1" allowOverlap="1" wp14:anchorId="54A0E012" wp14:editId="74A8DB7F">
+                <wp:simplePos x="0" y="0"/>
+                <wp:positionH relativeFrom="column">
+                  <wp:posOffset>124156</wp:posOffset>
+                </wp:positionH>
+                <wp:positionV relativeFrom="paragraph">
+                  <wp:posOffset>11845</wp:posOffset>
+                </wp:positionV>
+                <wp:extent cx="278296" cy="286247"/>
+                <wp:effectExtent l="0" t="0" r="26670" b="19050"/>
+                <wp:wrapNone/>
+                <wp:docPr id="1391496739" name="Marco 1"/>
+                <wp:cNvGraphicFramePr/>
+                <a:graphic xmlns:a="http://schemas.openxmlformats.org/drawingml/2006/main">
+                  <a:graphicData uri="http://schemas.microsoft.com/office/word/2010/wordprocessingShape">
+                    <wps:wsp>
+                      <wps:cNvSpPr/>
+                      <wps:spPr>
+                        <a:xfrm>
+                          <a:off x="0" y="0"/>
+                          <a:ext cx="278296" cy="286247"/>
+                        </a:xfrm>
+                        <a:prstGeom prst="frame">
+                          <a:avLst/>
+                        </a:prstGeom>
+                      </wps:spPr>
+                      <wps:style>
+                        <a:lnRef idx="2">
+                          <a:schemeClr val="dk1">
+                            <a:shade val="15000"/>
+                          </a:schemeClr>
+                        </a:lnRef>
+                        <a:fillRef idx="1">
+                          <a:schemeClr val="dk1"/>
+                        </a:fillRef>
+                        <a:effectRef idx="0">
+                          <a:schemeClr val="dk1"/>
+                        </a:effectRef>
+                        <a:fontRef idx="minor">
+                          <a:schemeClr val="lt1"/>
+                        </a:fontRef>
+                      </wps:style>
+                      <wps:bodyPr rot="0" spcFirstLastPara="0" vertOverflow="overflow" horzOverflow="overflow" vert="horz" wrap="square" lIns="91440" tIns="45720" rIns="91440" bIns="45720" numCol="1" spcCol="0" rtlCol="0" fromWordArt="0" anchor="ctr" anchorCtr="0" forceAA="0" compatLnSpc="1">
+                        <a:prstTxWarp prst="textNoShape">
+                          <a:avLst/>
+                        </a:prstTxWarp>
+                        <a:noAutofit/>
+                      </wps:bodyPr>
+                    </wps:wsp>
+                  </a:graphicData>
+                </a:graphic>
+              </wp:anchor>
+            </w:drawing>
+          </mc:Choice>
+          <mc:Fallback>
+            <w:pict>
+              <v:shape w14:anchorId="477733A7" id="Marco 1" o:spid="_x0000_s1026" style="position:absolute;margin-left:9.8pt;margin-top:.95pt;width:21.9pt;height:22.55pt;z-index:251661312;visibility:visible;mso-wrap-style:square;mso-wrap-distance-left:9pt;mso-wrap-distance-top:0;mso-wrap-distance-right:9pt;mso-wrap-distance-bottom:0;mso-position-horizontal:absolute;mso-position-horizontal-relative:text;mso-position-vertical:absolute;mso-position-vertical-relative:text;v-text-anchor:middle" coordsize="278296,286247" o:gfxdata="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" path="m,l278296,r,286247l,286247,,xm34787,34787r,216673l243509,251460r,-216673l34787,34787xe" fillcolor="black [3200]" strokecolor="black [480]" strokeweight="1.5pt">
+                <v:stroke joinstyle="miter"/>
+                <v:path arrowok="t" o:connecttype="custom" o:connectlocs="0,0;278296,0;278296,286247;0,286247;0,0;34787,34787;34787,251460;243509,251460;243509,34787;34787,34787" o:connectangles="0,0,0,0,0,0,0,0,0,0"/>
+              </v:shape>
+            </w:pict>
+          </mc:Fallback>
+        </mc:AlternateContent>
+      </w:r>
+      <w:r>
+        <w:rPr>
+          <w:rFonts w:ascii="Arial" w:hAnsi="Arial" w:cs="Arial"/>
+          <w:noProof/>
+          <w:sz w:val="48"/>
+          <w:szCs w:val="48"/>
+          <w:lang w:val="es-ES"/>
+        </w:rPr>
+        <w:t>EL BUEN SAMARITANO (</w:t>
+      </w:r>
+      <w:r>
+        <w:rPr>
+          <w:rFonts w:ascii="Arial" w:hAnsi="Arial" w:cs="Arial"/>
+          <w:noProof/>
+          <w:sz w:val="44"/>
+          <w:szCs w:val="44"/>
+          <w:lang w:val="es-ES"/>
+        </w:rPr>
+        <w:t>LUCAS 10 :25-37</w:t>
+      </w:r>
+      <w:r>
+        <w:rPr>
+          <w:rFonts w:ascii="Arial" w:hAnsi="Arial" w:cs="Arial"/>
+          <w:noProof/>
+          <w:sz w:val="48"/>
+          <w:szCs w:val="48"/>
+          <w:lang w:val="es-ES"/>
+        </w:rPr>
+        <w:t>)</w:t>
+      </w:r>
+    </w:p>
+    <w:p>
+      <w:pPr>
+        <w:pStyle w:val="Prrafodelista"/>
+        <w:rPr>
+          <w:rFonts w:ascii="Arial" w:hAnsi="Arial" w:cs="Arial"/>
+          <w:noProof/>
+          <w:sz w:val="48"/>
+          <w:szCs w:val="48"/>
+          <w:lang w:val="es-ES"/>
+        </w:rPr>
+      </w:pPr>
+      <w:r>
+        <w:rPr>
+          <w:rFonts w:ascii="Arial" w:hAnsi="Arial" w:cs="Arial"/>
+          <w:noProof/>
+          <w:sz w:val="48"/>
+          <w:szCs w:val="48"/>
+          <w:lang w:val="es-ES"/>
+        </w:rPr>
+        <mc:AlternateContent>
+          <mc:Choice Requires="wps">
+            <w:drawing>
+              <wp:anchor distT="0" distB="0" distL="114300" distR="114300" simplePos="0" relativeHeight="251663360" behindDoc="0" locked="0" layoutInCell="1" allowOverlap="1" wp14:anchorId="72E4FAB9" wp14:editId="3D50E77E">
+                <wp:simplePos x="0" y="0"/>
+                <wp:positionH relativeFrom="column">
+                  <wp:posOffset>116564</wp:posOffset>
+                </wp:positionH>
+                <wp:positionV relativeFrom="paragraph">
+                  <wp:posOffset>11237</wp:posOffset>
+                </wp:positionV>
+                <wp:extent cx="278296" cy="286247"/>
+                <wp:effectExtent l="0" t="0" r="26670" b="19050"/>
+                <wp:wrapNone/>
+                <wp:docPr id="1170396009" name="Marco 1"/>
+                <wp:cNvGraphicFramePr/>
+                <a:graphic xmlns:a="http://schemas.openxmlformats.org/drawingml/2006/main">
+                  <a:graphicData uri="http://schemas.microsoft.com/office/word/2010/wordprocessingShape">
+                    <wps:wsp>
+                      <wps:cNvSpPr/>
+                      <wps:spPr>
+                        <a:xfrm>
+                          <a:off x="0" y="0"/>
+                          <a:ext cx="278296" cy="286247"/>
+                        </a:xfrm>
+                        <a:prstGeom prst="frame">
+                          <a:avLst/>
+                        </a:prstGeom>
+                      </wps:spPr>
+                      <wps:style>
+                        <a:lnRef idx="2">
+                          <a:schemeClr val="dk1">
+                            <a:shade val="15000"/>
+                          </a:schemeClr>
+                        </a:lnRef>
+                        <a:fillRef idx="1">
+                          <a:schemeClr val="dk1"/>
+                        </a:fillRef>
+                        <a:effectRef idx="0">
+                          <a:schemeClr val="dk1"/>
+                        </a:effectRef>
+                        <a:fontRef idx="minor">
+                          <a:schemeClr val="lt1"/>
+                        </a:fontRef>
+                      </wps:style>
+                      <wps:bodyPr rot="0" spcFirstLastPara="0" vertOverflow="overflow" horzOverflow="overflow" vert="horz" wrap="square" lIns="91440" tIns="45720" rIns="91440" bIns="45720" numCol="1" spcCol="0" rtlCol="0" fromWordArt="0" anchor="ctr" anchorCtr="0" forceAA="0" compatLnSpc="1">
+                        <a:prstTxWarp prst="textNoShape">
+                          <a:avLst/>
+                        </a:prstTxWarp>
+                        <a:noAutofit/>
+                      </wps:bodyPr>
+                    </wps:wsp>
+                  </a:graphicData>
+                </a:graphic>
+              </wp:anchor>
+            </w:drawing>
+          </mc:Choice>
+          <mc:Fallback>
+            <w:pict>
+              <v:shape w14:anchorId="01D6FD10" id="Marco 1" o:spid="_x0000_s1026" style="position:absolute;margin-left:9.2pt;margin-top:.9pt;width:21.9pt;height:22.55pt;z-index:251663360;visibility:visible;mso-wrap-style:square;mso-wrap-distance-left:9pt;mso-wrap-distance-top:0;mso-wrap-distance-right:9pt;mso-wrap-distance-bottom:0;mso-position-horizontal:absolute;mso-position-horizontal-relative:text;mso-position-vertical:absolute;mso-position-vertical-relative:text;v-text-anchor:middle" coordsize="278296,286247" o:gfxdata="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" path="m,l278296,r,286247l,286247,,xm34787,34787r,216673l243509,251460r,-216673l34787,34787xe" fillcolor="black [3200]" strokecolor="black [480]" strokeweight="1.5pt">
+                <v:stroke joinstyle="miter"/>
+                <v:path arrowok="t" o:connecttype="custom" o:connectlocs="0,0;278296,0;278296,286247;0,286247;0,0;34787,34787;34787,251460;243509,251460;243509,34787;34787,34787" o:connectangles="0,0,0,0,0,0,0,0,0,0"/>
+              </v:shape>
+            </w:pict>
+          </mc:Fallback>
+        </mc:AlternateContent>
+      </w:r>
+      <w:r>
+        <w:rPr>
+          <w:rFonts w:ascii="Arial" w:hAnsi="Arial" w:cs="Arial"/>
+          <w:noProof/>
+          <w:sz w:val="48"/>
+          <w:szCs w:val="48"/>
+          <w:lang w:val="es-ES"/>
+        </w:rPr>
+        <w:t>EL HIJO PRÓDIGO (</w:t>
+      </w:r>
+      <w:r>
+        <w:rPr>
+          <w:rFonts w:ascii="Arial" w:hAnsi="Arial" w:cs="Arial"/>
+          <w:noProof/>
+          <w:sz w:val="44"/>
+          <w:szCs w:val="44"/>
+          <w:lang w:val="es-ES"/>
+        </w:rPr>
+        <w:t>LUCAS 15: 11-32</w:t>
+      </w:r>
+      <w:r>
+        <w:rPr>
+          <w:rFonts w:ascii="Arial" w:hAnsi="Arial" w:cs="Arial"/>
+          <w:noProof/>
+          <w:sz w:val="48"/>
+          <w:szCs w:val="48"/>
+          <w:lang w:val="es-ES"/>
+        </w:rPr>
+        <w:t>)</w:t>
+      </w:r>
+    </w:p>
+    <w:p>
+      <w:pPr>
+        <w:pStyle w:val="Prrafodelista"/>
+        <w:rPr>
+          <w:rFonts w:ascii="Arial" w:hAnsi="Arial" w:cs="Arial"/>
+          <w:noProof/>
+          <w:sz w:val="48"/>
+          <w:szCs w:val="48"/>
+          <w:lang w:val="es-ES"/>
+        </w:rPr>
+      </w:pPr>
+      <w:r>
+        <w:rPr>
+          <w:rFonts w:ascii="Arial" w:hAnsi="Arial" w:cs="Arial"/>
+          <w:noProof/>
+          <w:sz w:val="48"/>
+          <w:szCs w:val="48"/>
+          <w:lang w:val="es-ES"/>
+        </w:rPr>
+        <mc:AlternateContent>
+          <mc:Choice Requires="wps">
+            <w:drawing>
+              <wp:anchor distT="0" distB="0" distL="114300" distR="114300" simplePos="0" relativeHeight="251665408" behindDoc="0" locked="0" layoutInCell="1" allowOverlap="1" wp14:anchorId="6AD3F9EA" wp14:editId="2515BF36">
+                <wp:simplePos x="0" y="0"/>
+                <wp:positionH relativeFrom="column">
+                  <wp:posOffset>127221</wp:posOffset>
+                </wp:positionH>
+                <wp:positionV relativeFrom="paragraph">
+                  <wp:posOffset>7951</wp:posOffset>
+                </wp:positionV>
+                <wp:extent cx="278296" cy="286247"/>
+                <wp:effectExtent l="0" t="0" r="26670" b="19050"/>
+                <wp:wrapNone/>
+                <wp:docPr id="1600047735" name="Marco 1"/>
+                <wp:cNvGraphicFramePr/>
+                <a:graphic xmlns:a="http://schemas.openxmlformats.org/drawingml/2006/main">
+                  <a:graphicData uri="http://schemas.microsoft.com/office/word/2010/wordprocessingShape">
+                    <wps:wsp>
+                      <wps:cNvSpPr/>
+                      <wps:spPr>
+                        <a:xfrm>
+                          <a:off x="0" y="0"/>
+                          <a:ext cx="278296" cy="286247"/>
+                        </a:xfrm>
+                        <a:prstGeom prst="frame">
+                          <a:avLst/>
+                        </a:prstGeom>
+                      </wps:spPr>
+                      <wps:style>
+                        <a:lnRef idx="2">
+                          <a:schemeClr val="dk1">
+                            <a:shade val="15000"/>
+                          </a:schemeClr>
+                        </a:lnRef>
+                        <a:fillRef idx="1">
+                          <a:schemeClr val="dk1"/>
+                        </a:fillRef>
+                        <a:effectRef idx="0">
+                          <a:schemeClr val="dk1"/>
+                        </a:effectRef>
+                        <a:fontRef idx="minor">
+                          <a:schemeClr val="lt1"/>
+                        </a:fontRef>
+                      </wps:style>
+                      <wps:bodyPr rot="0" spcFirstLastPara="0" vertOverflow="overflow" horzOverflow="overflow" vert="horz" wrap="square" lIns="91440" tIns="45720" rIns="91440" bIns="45720" numCol="1" spcCol="0" rtlCol="0" fromWordArt="0" anchor="ctr" anchorCtr="0" forceAA="0" compatLnSpc="1">
+                        <a:prstTxWarp prst="textNoShape">
+                          <a:avLst/>
+                        </a:prstTxWarp>
+                        <a:noAutofit/>
+                      </wps:bodyPr>
+                    </wps:wsp>
+                  </a:graphicData>
+                </a:graphic>
+              </wp:anchor>
+            </w:drawing>
+          </mc:Choice>
+          <mc:Fallback>
+            <w:pict>
+              <v:shape w14:anchorId="164789A7" id="Marco 1" o:spid="_x0000_s1026" style="position:absolute;margin-left:10pt;margin-top:.65pt;width:21.9pt;height:22.55pt;z-index:251665408;visibility:visible;mso-wrap-style:square;mso-wrap-distance-left:9pt;mso-wrap-distance-top:0;mso-wrap-distance-right:9pt;mso-wrap-distance-bottom:0;mso-position-horizontal:absolute;mso-position-horizontal-relative:text;mso-position-vertical:absolute;mso-position-vertical-relative:text;v-text-anchor:middle" coordsize="278296,286247" o:gfxdata="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" path="m,l278296,r,286247l,286247,,xm34787,34787r,216673l243509,251460r,-216673l34787,34787xe" fillcolor="black [3200]" strokecolor="black [480]" strokeweight="1.5pt">
+                <v:stroke joinstyle="miter"/>
+                <v:path arrowok="t" o:connecttype="custom" o:connectlocs="0,0;278296,0;278296,286247;0,286247;0,0;34787,34787;34787,251460;243509,251460;243509,34787;34787,34787" o:connectangles="0,0,0,0,0,0,0,0,0,0"/>
+              </v:shape>
+            </w:pict>
+          </mc:Fallback>
+        </mc:AlternateContent>
+      </w:r>
+      <w:r>
+        <w:rPr>
+          <w:rFonts w:ascii="Arial" w:hAnsi="Arial" w:cs="Arial"/>
+          <w:noProof/>
+          <w:sz w:val="48"/>
+          <w:szCs w:val="48"/>
+          <w:lang w:val="es-ES"/>
+        </w:rPr>
+        <w:t>LOS OBREROS DE LA VIÑA (</w:t>
+      </w:r>
+      <w:r>
+        <w:rPr>
+          <w:rFonts w:ascii="Arial" w:hAnsi="Arial" w:cs="Arial"/>
+          <w:noProof/>
+          <w:sz w:val="44"/>
+          <w:szCs w:val="44"/>
+          <w:lang w:val="es-ES"/>
+        </w:rPr>
+        <w:t>MATEO 20:1-16</w:t>
+      </w:r>
+      <w:r>
+        <w:rPr>
+          <w:rFonts w:ascii="Arial" w:hAnsi="Arial" w:cs="Arial"/>
+          <w:noProof/>
+          <w:sz w:val="48"/>
+          <w:szCs w:val="48"/>
+          <w:lang w:val="es-ES"/>
+        </w:rPr>
+        <w:t>)</w:t>
+      </w:r>
+    </w:p>
+    <w:p>
+      <w:pPr>
+        <w:rPr>
+          <w:rFonts w:ascii="Arial" w:hAnsi="Arial" w:cs="Arial"/>
+          <w:noProof/>
+          <w:sz w:val="48"/>
+          <w:szCs w:val="48"/>
+          <w:lang w:val="es-ES"/>
+        </w:rPr>
+      </w:pPr>
+      <w:r>
+        <w:rPr>
+          <w:rFonts w:ascii="Arial" w:hAnsi="Arial" w:cs="Arial"/>
+          <w:noProof/>
+          <w:sz w:val="48"/>
+          <w:szCs w:val="48"/>
+          <w:lang w:val="es-ES"/>
+        </w:rPr>
+        <w:t>JUSTIFICACIÓN: _________________________ ________________________________________________________________________________________________________________________</w:t>
+      </w:r>
+      <w:r>
+        <w:rPr>
+          <w:rFonts w:ascii="Arial" w:hAnsi="Arial" w:cs="Arial"/>
+          <w:noProof/>
+          <w:sz w:val="48"/>
+          <w:szCs w:val="48"/>
+          <w:lang w:val="es-ES"/>
+        </w:rPr>
+        <w:br w:type="page"/>
       </w:r>
     </w:p>
     <w:p>
@@ -671,214 +1096,123 @@
           <w:numId w:val="2"/>
         </w:numPr>
         <w:rPr>
-          <w:noProof/>
-          <w:lang w:val="es-ES"/>
-        </w:rPr>
-      </w:pPr>
-      <w:r>
-        <w:rPr>
-          <w:noProof/>
-          <w:lang w:val="es-ES"/>
-        </w:rPr>
-        <w:t xml:space="preserve">De las siguientes parábolas, ¿en cuál piensas que se ve claramente el rol del Espíritu Santo? </w:t>
-      </w:r>
-      <w:r>
-        <w:rPr>
-          <w:b/>
-          <w:bCs/>
-          <w:noProof/>
-          <w:lang w:val="es-ES"/>
-        </w:rPr>
-        <w:t>Justifica</w:t>
-      </w:r>
-      <w:r>
-        <w:rPr>
-          <w:noProof/>
-          <w:lang w:val="es-ES"/>
-        </w:rPr>
-        <w:t>.</w:t>
+          <w:rFonts w:ascii="Arial" w:hAnsi="Arial" w:cs="Arial"/>
+          <w:noProof/>
+          <w:sz w:val="48"/>
+          <w:szCs w:val="48"/>
+          <w:lang w:val="es-ES"/>
+        </w:rPr>
+      </w:pPr>
+      <w:r>
+        <w:rPr>
+          <w:rFonts w:ascii="Arial" w:hAnsi="Arial" w:cs="Arial"/>
+          <w:noProof/>
+          <w:sz w:val="48"/>
+          <w:szCs w:val="48"/>
+          <w:lang w:val="es-ES"/>
+        </w:rPr>
+        <w:lastRenderedPageBreak/>
+        <w:t>DESPUÉS DE HABER LEÍDO LA UNIDAD 1, DA TU OPINIÓN DE LAS SIGUIENTES FRASES:</w:t>
       </w:r>
     </w:p>
     <w:p>
       <w:pPr>
         <w:pStyle w:val="Prrafodelista"/>
         <w:rPr>
-          <w:noProof/>
-          <w:lang w:val="es-ES"/>
-        </w:rPr>
-      </w:pPr>
+          <w:rFonts w:ascii="Arial" w:hAnsi="Arial" w:cs="Arial"/>
+          <w:noProof/>
+          <w:sz w:val="48"/>
+          <w:szCs w:val="48"/>
+          <w:lang w:val="es-ES"/>
+        </w:rPr>
+      </w:pPr>
+      <w:r>
+        <w:rPr>
+          <w:rFonts w:ascii="Arial" w:hAnsi="Arial" w:cs="Arial"/>
+          <w:noProof/>
+          <w:sz w:val="48"/>
+          <w:szCs w:val="48"/>
+          <w:lang w:val="es-ES"/>
+        </w:rPr>
+        <w:t>“DIOS ESTÁ MÁS ANSIOSO POR DERRAMAR SUS BENDICIONES SOBRE NOSOTROS QUE NOSOTROS POR RECIBIRLAS”  SAN AGUSTÍN.</w:t>
+      </w:r>
     </w:p>
     <w:p>
       <w:pPr>
         <w:pStyle w:val="Prrafodelista"/>
         <w:rPr>
-          <w:noProof/>
-          <w:lang w:val="es-ES"/>
-        </w:rPr>
-      </w:pPr>
-      <w:r>
-        <w:rPr>
-          <w:noProof/>
-          <w:lang w:val="es-ES"/>
-        </w:rPr>
-        <w:t>El sembrador (Lucas 8:4-15)</w:t>
-      </w:r>
+          <w:rFonts w:ascii="Arial" w:hAnsi="Arial" w:cs="Arial"/>
+          <w:noProof/>
+          <w:sz w:val="14"/>
+          <w:szCs w:val="14"/>
+          <w:lang w:val="es-ES"/>
+        </w:rPr>
+      </w:pPr>
     </w:p>
     <w:p>
       <w:pPr>
         <w:pStyle w:val="Prrafodelista"/>
         <w:rPr>
-          <w:noProof/>
-          <w:lang w:val="es-ES"/>
-        </w:rPr>
-      </w:pPr>
-      <w:r>
-        <w:rPr>
-          <w:noProof/>
-          <w:lang w:val="es-ES"/>
-        </w:rPr>
-        <w:t>El Buen Samaritano (Lucas 10 :25-37)</w:t>
+          <w:rFonts w:ascii="Arial" w:hAnsi="Arial" w:cs="Arial"/>
+          <w:noProof/>
+          <w:sz w:val="48"/>
+          <w:szCs w:val="48"/>
+          <w:lang w:val="es-ES"/>
+        </w:rPr>
+      </w:pPr>
+      <w:r>
+        <w:rPr>
+          <w:rFonts w:ascii="Arial" w:hAnsi="Arial" w:cs="Arial"/>
+          <w:noProof/>
+          <w:sz w:val="48"/>
+          <w:szCs w:val="48"/>
+          <w:lang w:val="es-ES"/>
+        </w:rPr>
+        <w:t>“SI QUIERES SABER LO QUE DIOS TIENE PARA DECIRTE, OBSEVA LO QUE CRISTO FUE Y ES HOY” CHARLES SPURGEON.</w:t>
       </w:r>
     </w:p>
     <w:p>
       <w:pPr>
         <w:pStyle w:val="Prrafodelista"/>
         <w:rPr>
-          <w:noProof/>
-          <w:lang w:val="es-ES"/>
-        </w:rPr>
-      </w:pPr>
-      <w:r>
-        <w:rPr>
-          <w:noProof/>
-          <w:lang w:val="es-ES"/>
-        </w:rPr>
-        <w:t>El hijo pródigo (</w:t>
-      </w:r>
-      <w:r>
-        <w:rPr>
-          <w:noProof/>
-          <w:lang w:val="es-ES"/>
-        </w:rPr>
-        <w:t>Lucas 15: 11-32)</w:t>
-      </w:r>
+          <w:rFonts w:ascii="Arial" w:hAnsi="Arial" w:cs="Arial"/>
+          <w:noProof/>
+          <w:sz w:val="14"/>
+          <w:szCs w:val="14"/>
+          <w:lang w:val="es-ES"/>
+        </w:rPr>
+      </w:pPr>
     </w:p>
     <w:p>
       <w:pPr>
         <w:pStyle w:val="Prrafodelista"/>
         <w:rPr>
-          <w:noProof/>
-          <w:lang w:val="es-ES"/>
-        </w:rPr>
-      </w:pPr>
-      <w:r>
-        <w:rPr>
-          <w:noProof/>
-          <w:lang w:val="es-ES"/>
-        </w:rPr>
-        <w:t>Los obreros de la viña (Mateo 20:1-16)</w:t>
+          <w:rFonts w:ascii="Arial" w:hAnsi="Arial" w:cs="Arial"/>
+          <w:noProof/>
+          <w:sz w:val="48"/>
+          <w:szCs w:val="48"/>
+          <w:lang w:val="es-ES"/>
+        </w:rPr>
+      </w:pPr>
+      <w:r>
+        <w:rPr>
+          <w:rFonts w:ascii="Arial" w:hAnsi="Arial" w:cs="Arial"/>
+          <w:noProof/>
+          <w:sz w:val="48"/>
+          <w:szCs w:val="48"/>
+          <w:lang w:val="es-ES"/>
+        </w:rPr>
+        <w:t>“CONSTRUÍR TEMPLOS ES MAS FÁCIL QUE SER TEMPLOS DEL ESPÍRITU SANTO.”  ELEANOR DOAN.</w:t>
       </w:r>
     </w:p>
     <w:p>
       <w:pPr>
         <w:pStyle w:val="Prrafodelista"/>
         <w:rPr>
-          <w:noProof/>
-          <w:lang w:val="es-ES"/>
-        </w:rPr>
-      </w:pPr>
-    </w:p>
-    <w:p>
-      <w:pPr>
-        <w:pStyle w:val="Prrafodelista"/>
-        <w:numPr>
-          <w:ilvl w:val="0"/>
-          <w:numId w:val="2"/>
-        </w:numPr>
-        <w:rPr>
-          <w:noProof/>
-          <w:lang w:val="es-ES"/>
-        </w:rPr>
-      </w:pPr>
-      <w:r>
-        <w:rPr>
-          <w:noProof/>
-          <w:lang w:val="es-ES"/>
-        </w:rPr>
-        <w:t>Después de haber leído la Unidad 1, da tu opinión de las siguientes frases:</w:t>
-      </w:r>
-    </w:p>
-    <w:p>
-      <w:pPr>
-        <w:pStyle w:val="Prrafodelista"/>
-        <w:rPr>
-          <w:noProof/>
-          <w:lang w:val="es-ES"/>
-        </w:rPr>
-      </w:pPr>
-      <w:r>
-        <w:rPr>
-          <w:noProof/>
-          <w:lang w:val="es-ES"/>
-        </w:rPr>
-        <w:t>“Dios está más ansioso por derramar sus bendiciones sobre nosotros que nosotros por recibirlas”  San Agustín.</w:t>
-      </w:r>
-    </w:p>
-    <w:p>
-      <w:pPr>
-        <w:pStyle w:val="Prrafodelista"/>
-        <w:rPr>
-          <w:noProof/>
-          <w:lang w:val="es-ES"/>
-        </w:rPr>
-      </w:pPr>
-    </w:p>
-    <w:p>
-      <w:pPr>
-        <w:pStyle w:val="Prrafodelista"/>
-        <w:rPr>
-          <w:noProof/>
-          <w:lang w:val="es-ES"/>
-        </w:rPr>
-      </w:pPr>
-      <w:r>
-        <w:rPr>
-          <w:noProof/>
-          <w:lang w:val="es-ES"/>
-        </w:rPr>
-        <w:t>“Si quieres saber lo que Dios tiene para decirte, obseva lo que Cristo fue y es hoy” Charles Spurgeon.</w:t>
-      </w:r>
-    </w:p>
-    <w:p>
-      <w:pPr>
-        <w:pStyle w:val="Prrafodelista"/>
-        <w:rPr>
-          <w:noProof/>
-          <w:lang w:val="es-ES"/>
-        </w:rPr>
-      </w:pPr>
-    </w:p>
-    <w:p>
-      <w:pPr>
-        <w:pStyle w:val="Prrafodelista"/>
-        <w:rPr>
-          <w:noProof/>
-          <w:lang w:val="es-ES"/>
-        </w:rPr>
-      </w:pPr>
-      <w:r>
-        <w:rPr>
-          <w:noProof/>
-          <w:lang w:val="es-ES"/>
-        </w:rPr>
-        <w:t>“Construír templos es mas fácil que ser templos del Espíritu Santo.”  Eleanor Doan.</w:t>
-      </w:r>
-    </w:p>
-    <w:p>
-      <w:pPr>
-        <w:pStyle w:val="Prrafodelista"/>
-        <w:rPr>
-          <w:noProof/>
+          <w:rFonts w:ascii="Arial" w:hAnsi="Arial" w:cs="Arial"/>
+          <w:noProof/>
+          <w:sz w:val="18"/>
+          <w:szCs w:val="18"/>
           <w:lang w:val="es-ES"/>
         </w:rPr>
       </w:pPr>
@@ -892,25 +1226,29 @@
         </w:numPr>
         <w:spacing w:after="0" w:line="240" w:lineRule="auto"/>
         <w:rPr>
-          <w:rFonts w:eastAsia="Times New Roman" w:cs="Arial"/>
+          <w:rFonts w:ascii="Arial" w:eastAsia="Times New Roman" w:hAnsi="Arial" w:cs="Arial"/>
           <w:kern w:val="0"/>
+          <w:sz w:val="48"/>
+          <w:szCs w:val="48"/>
           <w:lang w:eastAsia="es-AR"/>
           <w14:ligatures w14:val="none"/>
         </w:rPr>
       </w:pPr>
       <w:r>
         <w:rPr>
-          <w:rFonts w:eastAsia="Times New Roman" w:cs="Arial"/>
+          <w:rFonts w:ascii="Arial" w:eastAsia="Times New Roman" w:hAnsi="Arial" w:cs="Arial"/>
           <w:kern w:val="0"/>
+          <w:sz w:val="48"/>
+          <w:szCs w:val="48"/>
           <w:lang w:eastAsia="es-AR"/>
           <w14:ligatures w14:val="none"/>
         </w:rPr>
-        <w:t>Une con una línea cada nombre hebreo de Dios con su significado correspondiente en español, según la tabla amarilla del texto.</w:t>
+        <w:t>UNE CON UNA LÍNEA CADA NOMBRE HEBREO DE DIOS CON SU SIGNIFICADO CORRESPONDIENTE EN ESPAÑOL, SEGÚN LA TABLA AMARILLA DEL TEXTO.</w:t>
       </w:r>
     </w:p>
     <w:tbl>
       <w:tblPr>
-        <w:tblW w:w="6716" w:type="dxa"/>
+        <w:tblW w:w="10632" w:type="dxa"/>
         <w:tblCellSpacing w:w="15" w:type="dxa"/>
         <w:tblCellMar>
           <w:top w:w="15" w:type="dxa"/>
@@ -921,9 +1259,9 @@
         <w:tblLook w:val="04A0" w:firstRow="1" w:lastRow="0" w:firstColumn="1" w:lastColumn="0" w:noHBand="0" w:noVBand="1"/>
       </w:tblPr>
       <w:tblGrid>
-        <w:gridCol w:w="2735"/>
-        <w:gridCol w:w="78"/>
-        <w:gridCol w:w="3903"/>
+        <w:gridCol w:w="2529"/>
+        <w:gridCol w:w="3697"/>
+        <w:gridCol w:w="4406"/>
       </w:tblGrid>
       <w:tr>
         <w:trPr>
@@ -945,8 +1283,8 @@
                 <w:b/>
                 <w:bCs/>
                 <w:kern w:val="0"/>
-                <w:sz w:val="21"/>
-                <w:szCs w:val="21"/>
+                <w:sz w:val="48"/>
+                <w:szCs w:val="48"/>
                 <w:lang w:eastAsia="es-AR"/>
                 <w14:ligatures w14:val="none"/>
               </w:rPr>
@@ -957,18 +1295,18 @@
                 <w:b/>
                 <w:bCs/>
                 <w:kern w:val="0"/>
-                <w:sz w:val="21"/>
-                <w:szCs w:val="21"/>
+                <w:sz w:val="48"/>
+                <w:szCs w:val="48"/>
                 <w:lang w:eastAsia="es-AR"/>
                 <w14:ligatures w14:val="none"/>
               </w:rPr>
-              <w:t>Nombre Hebreo</w:t>
+              <w:t>NOMBRE HEBREO</w:t>
             </w:r>
           </w:p>
         </w:tc>
         <w:tc>
           <w:tcPr>
-            <w:tcW w:w="0" w:type="auto"/>
+            <w:tcW w:w="3667" w:type="dxa"/>
             <w:vAlign w:val="center"/>
             <w:hideMark/>
           </w:tcPr>
@@ -981,8 +1319,8 @@
                 <w:b/>
                 <w:bCs/>
                 <w:kern w:val="0"/>
-                <w:sz w:val="21"/>
-                <w:szCs w:val="21"/>
+                <w:sz w:val="48"/>
+                <w:szCs w:val="48"/>
                 <w:lang w:eastAsia="es-AR"/>
                 <w14:ligatures w14:val="none"/>
               </w:rPr>
@@ -991,7 +1329,7 @@
         </w:tc>
         <w:tc>
           <w:tcPr>
-            <w:tcW w:w="0" w:type="auto"/>
+            <w:tcW w:w="4361" w:type="dxa"/>
             <w:vAlign w:val="center"/>
             <w:hideMark/>
           </w:tcPr>
@@ -1004,8 +1342,8 @@
                 <w:b/>
                 <w:bCs/>
                 <w:kern w:val="0"/>
-                <w:sz w:val="21"/>
-                <w:szCs w:val="21"/>
+                <w:sz w:val="48"/>
+                <w:szCs w:val="48"/>
                 <w:lang w:eastAsia="es-AR"/>
                 <w14:ligatures w14:val="none"/>
               </w:rPr>
@@ -1016,12 +1354,12 @@
                 <w:b/>
                 <w:bCs/>
                 <w:kern w:val="0"/>
-                <w:sz w:val="21"/>
-                <w:szCs w:val="21"/>
+                <w:sz w:val="48"/>
+                <w:szCs w:val="48"/>
                 <w:lang w:eastAsia="es-AR"/>
                 <w14:ligatures w14:val="none"/>
               </w:rPr>
-              <w:t>Significado en Español</w:t>
+              <w:t>SIGNIFICADO EN ESPAÑOL</w:t>
             </w:r>
           </w:p>
         </w:tc>
@@ -1043,8 +1381,8 @@
               <w:rPr>
                 <w:rFonts w:ascii="Arial" w:eastAsia="Times New Roman" w:hAnsi="Arial" w:cs="Arial"/>
                 <w:kern w:val="0"/>
-                <w:sz w:val="21"/>
-                <w:szCs w:val="21"/>
+                <w:sz w:val="48"/>
+                <w:szCs w:val="48"/>
                 <w:lang w:eastAsia="es-AR"/>
                 <w14:ligatures w14:val="none"/>
               </w:rPr>
@@ -1055,30 +1393,29 @@
                 <w:b/>
                 <w:bCs/>
                 <w:kern w:val="0"/>
-                <w:sz w:val="21"/>
-                <w:szCs w:val="21"/>
+                <w:sz w:val="48"/>
+                <w:szCs w:val="48"/>
                 <w:lang w:eastAsia="es-AR"/>
                 <w14:ligatures w14:val="none"/>
               </w:rPr>
-              <w:lastRenderedPageBreak/>
               <w:t>1.</w:t>
             </w:r>
             <w:r>
               <w:rPr>
                 <w:rFonts w:ascii="Arial" w:eastAsia="Times New Roman" w:hAnsi="Arial" w:cs="Arial"/>
                 <w:kern w:val="0"/>
-                <w:sz w:val="21"/>
-                <w:szCs w:val="21"/>
+                <w:sz w:val="48"/>
+                <w:szCs w:val="48"/>
                 <w:lang w:eastAsia="es-AR"/>
                 <w14:ligatures w14:val="none"/>
               </w:rPr>
-              <w:t xml:space="preserve"> Yahweh Shammah</w:t>
+              <w:t xml:space="preserve"> YAHWEH SHAMMAH</w:t>
             </w:r>
           </w:p>
         </w:tc>
         <w:tc>
           <w:tcPr>
-            <w:tcW w:w="0" w:type="auto"/>
+            <w:tcW w:w="3667" w:type="dxa"/>
             <w:vAlign w:val="center"/>
             <w:hideMark/>
           </w:tcPr>
@@ -1088,8 +1425,8 @@
               <w:rPr>
                 <w:rFonts w:ascii="Arial" w:eastAsia="Times New Roman" w:hAnsi="Arial" w:cs="Arial"/>
                 <w:kern w:val="0"/>
-                <w:sz w:val="21"/>
-                <w:szCs w:val="21"/>
+                <w:sz w:val="48"/>
+                <w:szCs w:val="48"/>
                 <w:lang w:eastAsia="es-AR"/>
                 <w14:ligatures w14:val="none"/>
               </w:rPr>
@@ -1098,7 +1435,7 @@
         </w:tc>
         <w:tc>
           <w:tcPr>
-            <w:tcW w:w="0" w:type="auto"/>
+            <w:tcW w:w="4361" w:type="dxa"/>
             <w:vAlign w:val="center"/>
             <w:hideMark/>
           </w:tcPr>
@@ -1108,8 +1445,8 @@
               <w:rPr>
                 <w:rFonts w:ascii="Arial" w:eastAsia="Times New Roman" w:hAnsi="Arial" w:cs="Arial"/>
                 <w:kern w:val="0"/>
-                <w:sz w:val="21"/>
-                <w:szCs w:val="21"/>
+                <w:sz w:val="48"/>
+                <w:szCs w:val="48"/>
                 <w:lang w:eastAsia="es-AR"/>
                 <w14:ligatures w14:val="none"/>
               </w:rPr>
@@ -1120,8 +1457,8 @@
                 <w:b/>
                 <w:bCs/>
                 <w:kern w:val="0"/>
-                <w:sz w:val="21"/>
-                <w:szCs w:val="21"/>
+                <w:sz w:val="48"/>
+                <w:szCs w:val="48"/>
                 <w:lang w:eastAsia="es-AR"/>
                 <w14:ligatures w14:val="none"/>
               </w:rPr>
@@ -1131,12 +1468,12 @@
               <w:rPr>
                 <w:rFonts w:ascii="Arial" w:eastAsia="Times New Roman" w:hAnsi="Arial" w:cs="Arial"/>
                 <w:kern w:val="0"/>
-                <w:sz w:val="21"/>
-                <w:szCs w:val="21"/>
+                <w:sz w:val="48"/>
+                <w:szCs w:val="48"/>
                 <w:lang w:eastAsia="es-AR"/>
                 <w14:ligatures w14:val="none"/>
               </w:rPr>
-              <w:t xml:space="preserve"> "Yahweh nuestra paz"</w:t>
+              <w:t xml:space="preserve"> "YAHWEH NUESTRA PAZ"</w:t>
             </w:r>
           </w:p>
         </w:tc>
@@ -1158,8 +1495,8 @@
               <w:rPr>
                 <w:rFonts w:ascii="Arial" w:eastAsia="Times New Roman" w:hAnsi="Arial" w:cs="Arial"/>
                 <w:kern w:val="0"/>
-                <w:sz w:val="21"/>
-                <w:szCs w:val="21"/>
+                <w:sz w:val="48"/>
+                <w:szCs w:val="48"/>
                 <w:lang w:eastAsia="es-AR"/>
                 <w14:ligatures w14:val="none"/>
               </w:rPr>
@@ -1170,8 +1507,8 @@
                 <w:b/>
                 <w:bCs/>
                 <w:kern w:val="0"/>
-                <w:sz w:val="21"/>
-                <w:szCs w:val="21"/>
+                <w:sz w:val="48"/>
+                <w:szCs w:val="48"/>
                 <w:lang w:eastAsia="es-AR"/>
                 <w14:ligatures w14:val="none"/>
               </w:rPr>
@@ -1181,18 +1518,18 @@
               <w:rPr>
                 <w:rFonts w:ascii="Arial" w:eastAsia="Times New Roman" w:hAnsi="Arial" w:cs="Arial"/>
                 <w:kern w:val="0"/>
-                <w:sz w:val="21"/>
-                <w:szCs w:val="21"/>
+                <w:sz w:val="48"/>
+                <w:szCs w:val="48"/>
                 <w:lang w:eastAsia="es-AR"/>
                 <w14:ligatures w14:val="none"/>
               </w:rPr>
-              <w:t xml:space="preserve"> El Shaddai</w:t>
+              <w:t xml:space="preserve"> EL SHADDAI</w:t>
             </w:r>
           </w:p>
         </w:tc>
         <w:tc>
           <w:tcPr>
-            <w:tcW w:w="0" w:type="auto"/>
+            <w:tcW w:w="3667" w:type="dxa"/>
             <w:vAlign w:val="center"/>
             <w:hideMark/>
           </w:tcPr>
@@ -1202,8 +1539,8 @@
               <w:rPr>
                 <w:rFonts w:ascii="Arial" w:eastAsia="Times New Roman" w:hAnsi="Arial" w:cs="Arial"/>
                 <w:kern w:val="0"/>
-                <w:sz w:val="21"/>
-                <w:szCs w:val="21"/>
+                <w:sz w:val="48"/>
+                <w:szCs w:val="48"/>
                 <w:lang w:eastAsia="es-AR"/>
                 <w14:ligatures w14:val="none"/>
               </w:rPr>
@@ -1212,7 +1549,7 @@
         </w:tc>
         <w:tc>
           <w:tcPr>
-            <w:tcW w:w="0" w:type="auto"/>
+            <w:tcW w:w="4361" w:type="dxa"/>
             <w:vAlign w:val="center"/>
             <w:hideMark/>
           </w:tcPr>
@@ -1222,8 +1559,8 @@
               <w:rPr>
                 <w:rFonts w:ascii="Arial" w:eastAsia="Times New Roman" w:hAnsi="Arial" w:cs="Arial"/>
                 <w:kern w:val="0"/>
-                <w:sz w:val="21"/>
-                <w:szCs w:val="21"/>
+                <w:sz w:val="48"/>
+                <w:szCs w:val="48"/>
                 <w:lang w:eastAsia="es-AR"/>
                 <w14:ligatures w14:val="none"/>
               </w:rPr>
@@ -1234,8 +1571,8 @@
                 <w:b/>
                 <w:bCs/>
                 <w:kern w:val="0"/>
-                <w:sz w:val="21"/>
-                <w:szCs w:val="21"/>
+                <w:sz w:val="48"/>
+                <w:szCs w:val="48"/>
                 <w:lang w:eastAsia="es-AR"/>
                 <w14:ligatures w14:val="none"/>
               </w:rPr>
@@ -1245,12 +1582,12 @@
               <w:rPr>
                 <w:rFonts w:ascii="Arial" w:eastAsia="Times New Roman" w:hAnsi="Arial" w:cs="Arial"/>
                 <w:kern w:val="0"/>
-                <w:sz w:val="21"/>
-                <w:szCs w:val="21"/>
+                <w:sz w:val="48"/>
+                <w:szCs w:val="48"/>
                 <w:lang w:eastAsia="es-AR"/>
                 <w14:ligatures w14:val="none"/>
               </w:rPr>
-              <w:t xml:space="preserve"> "Dios Todopoderoso"</w:t>
+              <w:t xml:space="preserve"> "DIOS TODOPODEROSO"</w:t>
             </w:r>
           </w:p>
         </w:tc>
@@ -1272,8 +1609,8 @@
               <w:rPr>
                 <w:rFonts w:ascii="Arial" w:eastAsia="Times New Roman" w:hAnsi="Arial" w:cs="Arial"/>
                 <w:kern w:val="0"/>
-                <w:sz w:val="21"/>
-                <w:szCs w:val="21"/>
+                <w:sz w:val="48"/>
+                <w:szCs w:val="48"/>
                 <w:lang w:eastAsia="es-AR"/>
                 <w14:ligatures w14:val="none"/>
               </w:rPr>
@@ -1284,8 +1621,8 @@
                 <w:b/>
                 <w:bCs/>
                 <w:kern w:val="0"/>
-                <w:sz w:val="21"/>
-                <w:szCs w:val="21"/>
+                <w:sz w:val="48"/>
+                <w:szCs w:val="48"/>
                 <w:lang w:eastAsia="es-AR"/>
                 <w14:ligatures w14:val="none"/>
               </w:rPr>
@@ -1295,18 +1632,18 @@
               <w:rPr>
                 <w:rFonts w:ascii="Arial" w:eastAsia="Times New Roman" w:hAnsi="Arial" w:cs="Arial"/>
                 <w:kern w:val="0"/>
-                <w:sz w:val="21"/>
-                <w:szCs w:val="21"/>
+                <w:sz w:val="48"/>
+                <w:szCs w:val="48"/>
                 <w:lang w:eastAsia="es-AR"/>
                 <w14:ligatures w14:val="none"/>
               </w:rPr>
-              <w:t xml:space="preserve"> Yahweh Shalom</w:t>
+              <w:t xml:space="preserve"> YAHWEH SHALOM</w:t>
             </w:r>
           </w:p>
         </w:tc>
         <w:tc>
           <w:tcPr>
-            <w:tcW w:w="0" w:type="auto"/>
+            <w:tcW w:w="3667" w:type="dxa"/>
             <w:vAlign w:val="center"/>
             <w:hideMark/>
           </w:tcPr>
@@ -1316,8 +1653,8 @@
               <w:rPr>
                 <w:rFonts w:ascii="Arial" w:eastAsia="Times New Roman" w:hAnsi="Arial" w:cs="Arial"/>
                 <w:kern w:val="0"/>
-                <w:sz w:val="21"/>
-                <w:szCs w:val="21"/>
+                <w:sz w:val="48"/>
+                <w:szCs w:val="48"/>
                 <w:lang w:eastAsia="es-AR"/>
                 <w14:ligatures w14:val="none"/>
               </w:rPr>
@@ -1326,7 +1663,7 @@
         </w:tc>
         <w:tc>
           <w:tcPr>
-            <w:tcW w:w="0" w:type="auto"/>
+            <w:tcW w:w="4361" w:type="dxa"/>
             <w:vAlign w:val="center"/>
             <w:hideMark/>
           </w:tcPr>
@@ -1336,8 +1673,8 @@
               <w:rPr>
                 <w:rFonts w:ascii="Arial" w:eastAsia="Times New Roman" w:hAnsi="Arial" w:cs="Arial"/>
                 <w:kern w:val="0"/>
-                <w:sz w:val="21"/>
-                <w:szCs w:val="21"/>
+                <w:sz w:val="48"/>
+                <w:szCs w:val="48"/>
                 <w:lang w:eastAsia="es-AR"/>
                 <w14:ligatures w14:val="none"/>
               </w:rPr>
@@ -1348,8 +1685,8 @@
                 <w:b/>
                 <w:bCs/>
                 <w:kern w:val="0"/>
-                <w:sz w:val="21"/>
-                <w:szCs w:val="21"/>
+                <w:sz w:val="48"/>
+                <w:szCs w:val="48"/>
                 <w:lang w:eastAsia="es-AR"/>
                 <w14:ligatures w14:val="none"/>
               </w:rPr>
@@ -1359,12 +1696,12 @@
               <w:rPr>
                 <w:rFonts w:ascii="Arial" w:eastAsia="Times New Roman" w:hAnsi="Arial" w:cs="Arial"/>
                 <w:kern w:val="0"/>
-                <w:sz w:val="21"/>
-                <w:szCs w:val="21"/>
+                <w:sz w:val="48"/>
+                <w:szCs w:val="48"/>
                 <w:lang w:eastAsia="es-AR"/>
                 <w14:ligatures w14:val="none"/>
               </w:rPr>
-              <w:t xml:space="preserve"> "Yahweh está con nosotros"</w:t>
+              <w:t xml:space="preserve"> "YAHWEH ESTÁ CON NOSOTROS"</w:t>
             </w:r>
           </w:p>
         </w:tc>
@@ -1386,8 +1723,8 @@
               <w:rPr>
                 <w:rFonts w:ascii="Arial" w:eastAsia="Times New Roman" w:hAnsi="Arial" w:cs="Arial"/>
                 <w:kern w:val="0"/>
-                <w:sz w:val="21"/>
-                <w:szCs w:val="21"/>
+                <w:sz w:val="48"/>
+                <w:szCs w:val="48"/>
                 <w:lang w:eastAsia="es-AR"/>
                 <w14:ligatures w14:val="none"/>
               </w:rPr>
@@ -1398,8 +1735,8 @@
                 <w:b/>
                 <w:bCs/>
                 <w:kern w:val="0"/>
-                <w:sz w:val="21"/>
-                <w:szCs w:val="21"/>
+                <w:sz w:val="48"/>
+                <w:szCs w:val="48"/>
                 <w:lang w:eastAsia="es-AR"/>
                 <w14:ligatures w14:val="none"/>
               </w:rPr>
@@ -1409,18 +1746,18 @@
               <w:rPr>
                 <w:rFonts w:ascii="Arial" w:eastAsia="Times New Roman" w:hAnsi="Arial" w:cs="Arial"/>
                 <w:kern w:val="0"/>
-                <w:sz w:val="21"/>
-                <w:szCs w:val="21"/>
+                <w:sz w:val="48"/>
+                <w:szCs w:val="48"/>
                 <w:lang w:eastAsia="es-AR"/>
                 <w14:ligatures w14:val="none"/>
               </w:rPr>
-              <w:t xml:space="preserve"> El Olam</w:t>
+              <w:t xml:space="preserve"> EL OLAM</w:t>
             </w:r>
           </w:p>
         </w:tc>
         <w:tc>
           <w:tcPr>
-            <w:tcW w:w="0" w:type="auto"/>
+            <w:tcW w:w="3667" w:type="dxa"/>
             <w:vAlign w:val="center"/>
             <w:hideMark/>
           </w:tcPr>
@@ -1430,8 +1767,8 @@
               <w:rPr>
                 <w:rFonts w:ascii="Arial" w:eastAsia="Times New Roman" w:hAnsi="Arial" w:cs="Arial"/>
                 <w:kern w:val="0"/>
-                <w:sz w:val="21"/>
-                <w:szCs w:val="21"/>
+                <w:sz w:val="48"/>
+                <w:szCs w:val="48"/>
                 <w:lang w:eastAsia="es-AR"/>
                 <w14:ligatures w14:val="none"/>
               </w:rPr>
@@ -1440,7 +1777,7 @@
         </w:tc>
         <w:tc>
           <w:tcPr>
-            <w:tcW w:w="0" w:type="auto"/>
+            <w:tcW w:w="4361" w:type="dxa"/>
             <w:vAlign w:val="center"/>
             <w:hideMark/>
           </w:tcPr>
@@ -1450,8 +1787,8 @@
               <w:rPr>
                 <w:rFonts w:ascii="Arial" w:eastAsia="Times New Roman" w:hAnsi="Arial" w:cs="Arial"/>
                 <w:kern w:val="0"/>
-                <w:sz w:val="21"/>
-                <w:szCs w:val="21"/>
+                <w:sz w:val="48"/>
+                <w:szCs w:val="48"/>
                 <w:lang w:eastAsia="es-AR"/>
                 <w14:ligatures w14:val="none"/>
               </w:rPr>
@@ -1462,8 +1799,8 @@
                 <w:b/>
                 <w:bCs/>
                 <w:kern w:val="0"/>
-                <w:sz w:val="21"/>
-                <w:szCs w:val="21"/>
+                <w:sz w:val="48"/>
+                <w:szCs w:val="48"/>
                 <w:lang w:eastAsia="es-AR"/>
                 <w14:ligatures w14:val="none"/>
               </w:rPr>
@@ -1473,80 +1810,13 @@
               <w:rPr>
                 <w:rFonts w:ascii="Arial" w:eastAsia="Times New Roman" w:hAnsi="Arial" w:cs="Arial"/>
                 <w:kern w:val="0"/>
-                <w:sz w:val="21"/>
-                <w:szCs w:val="21"/>
+                <w:sz w:val="48"/>
+                <w:szCs w:val="48"/>
                 <w:lang w:eastAsia="es-AR"/>
                 <w14:ligatures w14:val="none"/>
               </w:rPr>
-              <w:t xml:space="preserve"> "Dios Eterno"</w:t>
+              <w:t xml:space="preserve"> "DIOS ETERNO"</w:t>
             </w:r>
-          </w:p>
-        </w:tc>
-      </w:tr>
-      <w:tr>
-        <w:trPr>
-          <w:trHeight w:val="554"/>
-          <w:tblCellSpacing w:w="15" w:type="dxa"/>
-        </w:trPr>
-        <w:tc>
-          <w:tcPr>
-            <w:tcW w:w="0" w:type="auto"/>
-            <w:vAlign w:val="center"/>
-          </w:tcPr>
-          <w:p>
-            <w:pPr>
-              <w:spacing w:after="0" w:line="240" w:lineRule="auto"/>
-              <w:rPr>
-                <w:rFonts w:ascii="Arial" w:eastAsia="Times New Roman" w:hAnsi="Arial" w:cs="Arial"/>
-                <w:b/>
-                <w:bCs/>
-                <w:kern w:val="0"/>
-                <w:sz w:val="21"/>
-                <w:szCs w:val="21"/>
-                <w:lang w:eastAsia="es-AR"/>
-                <w14:ligatures w14:val="none"/>
-              </w:rPr>
-            </w:pPr>
-          </w:p>
-        </w:tc>
-        <w:tc>
-          <w:tcPr>
-            <w:tcW w:w="0" w:type="auto"/>
-            <w:vAlign w:val="center"/>
-          </w:tcPr>
-          <w:p>
-            <w:pPr>
-              <w:spacing w:after="0" w:line="240" w:lineRule="auto"/>
-              <w:rPr>
-                <w:rFonts w:ascii="Arial" w:eastAsia="Times New Roman" w:hAnsi="Arial" w:cs="Arial"/>
-                <w:kern w:val="0"/>
-                <w:sz w:val="21"/>
-                <w:szCs w:val="21"/>
-                <w:lang w:eastAsia="es-AR"/>
-                <w14:ligatures w14:val="none"/>
-              </w:rPr>
-            </w:pPr>
-          </w:p>
-        </w:tc>
-        <w:tc>
-          <w:tcPr>
-            <w:tcW w:w="0" w:type="auto"/>
-            <w:vAlign w:val="center"/>
-          </w:tcPr>
-          <w:p>
-            <w:pPr>
-              <w:spacing w:after="0" w:line="240" w:lineRule="auto"/>
-              <w:rPr>
-                <w:rFonts w:ascii="Arial" w:eastAsia="Times New Roman" w:hAnsi="Arial" w:cs="Arial"/>
-                <w:b/>
-                <w:bCs/>
-                <w:kern w:val="0"/>
-                <w:sz w:val="21"/>
-                <w:szCs w:val="21"/>
-                <w:lang w:eastAsia="es-AR"/>
-                <w14:ligatures w14:val="none"/>
-              </w:rPr>
-            </w:pPr>
           </w:p>
         </w:tc>
       </w:tr>
@@ -1560,141 +1830,100 @@
         </w:numPr>
         <w:spacing w:after="0" w:line="240" w:lineRule="auto"/>
         <w:rPr>
-          <w:rFonts w:eastAsia="Times New Roman" w:cs="Arial"/>
+          <w:rFonts w:ascii="Arial" w:eastAsia="Times New Roman" w:hAnsi="Arial" w:cs="Arial"/>
           <w:b/>
           <w:bCs/>
           <w:kern w:val="0"/>
+          <w:sz w:val="48"/>
+          <w:szCs w:val="48"/>
           <w:lang w:eastAsia="es-AR"/>
           <w14:ligatures w14:val="none"/>
         </w:rPr>
       </w:pPr>
       <w:r>
         <w:rPr>
-          <w:rFonts w:eastAsia="Times New Roman" w:cs="Arial"/>
+          <w:rFonts w:ascii="Arial" w:eastAsia="Times New Roman" w:hAnsi="Arial" w:cs="Arial"/>
           <w:b/>
           <w:bCs/>
           <w:kern w:val="0"/>
+          <w:sz w:val="48"/>
+          <w:szCs w:val="48"/>
           <w:lang w:eastAsia="es-AR"/>
           <w14:ligatures w14:val="none"/>
         </w:rPr>
-        <w:t>El Folleto de las Dos Caras (Divino vs. Humano)</w:t>
+        <w:lastRenderedPageBreak/>
+        <w:t>EL FOLLETO DE LAS DOS CARAS (DIVINO VS. HUMANO)</w:t>
       </w:r>
     </w:p>
     <w:p>
       <w:pPr>
         <w:spacing w:after="0" w:line="240" w:lineRule="auto"/>
         <w:rPr>
-          <w:rFonts w:eastAsia="Times New Roman" w:cs="Arial"/>
+          <w:rFonts w:ascii="Arial" w:eastAsia="Times New Roman" w:hAnsi="Arial" w:cs="Arial"/>
           <w:kern w:val="0"/>
+          <w:sz w:val="48"/>
+          <w:szCs w:val="48"/>
           <w:lang w:eastAsia="es-AR"/>
           <w14:ligatures w14:val="none"/>
         </w:rPr>
       </w:pPr>
       <w:r>
         <w:rPr>
-          <w:rFonts w:eastAsia="Times New Roman" w:cs="Arial"/>
+          <w:rFonts w:ascii="Arial" w:eastAsia="Times New Roman" w:hAnsi="Arial" w:cs="Arial"/>
           <w:b/>
           <w:bCs/>
           <w:kern w:val="0"/>
+          <w:sz w:val="48"/>
+          <w:szCs w:val="48"/>
           <w:lang w:eastAsia="es-AR"/>
           <w14:ligatures w14:val="none"/>
         </w:rPr>
-        <w:t>Imagina</w:t>
-      </w:r>
-      <w:r>
-        <w:rPr>
-          <w:rFonts w:eastAsia="Times New Roman" w:cs="Arial"/>
+        <w:t>IMAGINA:</w:t>
+      </w:r>
+      <w:r>
+        <w:rPr>
+          <w:rFonts w:ascii="Arial" w:eastAsia="Times New Roman" w:hAnsi="Arial" w:cs="Arial"/>
+          <w:kern w:val="0"/>
+          <w:sz w:val="48"/>
+          <w:szCs w:val="48"/>
+          <w:lang w:eastAsia="es-AR"/>
+          <w14:ligatures w14:val="none"/>
+        </w:rPr>
+        <w:t xml:space="preserve"> UNA FUNDACIÓN JUVENIL TE HA ENCARGADO DISEÑAR EL FOLLETO OFICIAL PARA UN CAMPAMENTO DE JÓVENES. EL LEMA DEL CAMPAMENTO ES: </w:t>
+      </w:r>
+      <w:r>
+        <w:rPr>
+          <w:rFonts w:ascii="Arial" w:eastAsia="Times New Roman" w:hAnsi="Arial" w:cs="Arial"/>
           <w:b/>
           <w:bCs/>
           <w:kern w:val="0"/>
+          <w:sz w:val="48"/>
+          <w:szCs w:val="48"/>
           <w:lang w:eastAsia="es-AR"/>
           <w14:ligatures w14:val="none"/>
         </w:rPr>
-        <w:t>:</w:t>
-      </w:r>
-      <w:r>
-        <w:rPr>
-          <w:rFonts w:eastAsia="Times New Roman" w:cs="Arial"/>
+        <w:t>"JESÚS: EL DIOS QUE NOS ENTIENDE"</w:t>
+      </w:r>
+      <w:r>
+        <w:rPr>
+          <w:rFonts w:ascii="Arial" w:eastAsia="Times New Roman" w:hAnsi="Arial" w:cs="Arial"/>
           <w:kern w:val="0"/>
+          <w:sz w:val="48"/>
+          <w:szCs w:val="48"/>
           <w:lang w:eastAsia="es-AR"/>
           <w14:ligatures w14:val="none"/>
         </w:rPr>
-        <w:t xml:space="preserve"> Una fundación juvenil te ha encargado diseñar el folleto oficial para un campamento de jóvenes. El lema del campamento es: </w:t>
-      </w:r>
-      <w:r>
-        <w:rPr>
-          <w:rFonts w:eastAsia="Times New Roman" w:cs="Arial"/>
-          <w:b/>
-          <w:bCs/>
+        <w:t>. TU TRABAJO ES DISEÑAR UN FOLLETO DIGITAL DE UNA CARILLA A4 O 2 DE LAS HOJAS N°3,  QUE MUESTRE EL EQUILIBRIO PERFECTO ENTRE EL JESÚS DIVINO Y EL JESÚS HUMANO UTILIZANDO LOS DATOS DEL CAP 2.</w:t>
+      </w:r>
+    </w:p>
+    <w:p>
+      <w:pPr>
+        <w:spacing w:after="0" w:line="240" w:lineRule="auto"/>
+        <w:rPr>
+          <w:rFonts w:ascii="Arial" w:eastAsia="Times New Roman" w:hAnsi="Arial" w:cs="Arial"/>
           <w:kern w:val="0"/>
-          <w:lang w:eastAsia="es-AR"/>
-          <w14:ligatures w14:val="none"/>
-        </w:rPr>
-        <w:t>"Jesús: El Dios que nos entiende"</w:t>
-      </w:r>
-      <w:r>
-        <w:rPr>
-          <w:rFonts w:eastAsia="Times New Roman" w:cs="Arial"/>
-          <w:kern w:val="0"/>
-          <w:lang w:eastAsia="es-AR"/>
-          <w14:ligatures w14:val="none"/>
-        </w:rPr>
-        <w:t xml:space="preserve">. Tu trabajo es diseñar un folleto digital de </w:t>
-      </w:r>
-      <w:r>
-        <w:rPr>
-          <w:rFonts w:eastAsia="Times New Roman" w:cs="Arial"/>
-          <w:kern w:val="0"/>
-          <w:lang w:eastAsia="es-AR"/>
-          <w14:ligatures w14:val="none"/>
-        </w:rPr>
-        <w:t xml:space="preserve">una carilla A4 o 2 de las hojas N°3, </w:t>
-      </w:r>
-      <w:r>
-        <w:rPr>
-          <w:rFonts w:eastAsia="Times New Roman" w:cs="Arial"/>
-          <w:kern w:val="0"/>
-          <w:lang w:eastAsia="es-AR"/>
-          <w14:ligatures w14:val="none"/>
-        </w:rPr>
-        <w:t xml:space="preserve"> que muestre el equilibrio perfecto entre el Jesús Divino y el Jesús Humano utilizando los datos de</w:t>
-      </w:r>
-      <w:r>
-        <w:rPr>
-          <w:rFonts w:eastAsia="Times New Roman" w:cs="Arial"/>
-          <w:kern w:val="0"/>
-          <w:lang w:eastAsia="es-AR"/>
-          <w14:ligatures w14:val="none"/>
-        </w:rPr>
-        <w:t xml:space="preserve">l </w:t>
-      </w:r>
-      <w:proofErr w:type="spellStart"/>
-      <w:r>
-        <w:rPr>
-          <w:rFonts w:eastAsia="Times New Roman" w:cs="Arial"/>
-          <w:kern w:val="0"/>
-          <w:lang w:eastAsia="es-AR"/>
-          <w14:ligatures w14:val="none"/>
-        </w:rPr>
-        <w:t>cap</w:t>
-      </w:r>
-      <w:proofErr w:type="spellEnd"/>
-      <w:r>
-        <w:rPr>
-          <w:rFonts w:eastAsia="Times New Roman" w:cs="Arial"/>
-          <w:kern w:val="0"/>
-          <w:lang w:eastAsia="es-AR"/>
-          <w14:ligatures w14:val="none"/>
-        </w:rPr>
-        <w:t xml:space="preserve"> 2.</w:t>
-      </w:r>
-    </w:p>
-    <w:p>
-      <w:pPr>
-        <w:spacing w:after="0" w:line="240" w:lineRule="auto"/>
-        <w:rPr>
-          <w:rFonts w:eastAsia="Times New Roman" w:cs="Arial"/>
-          <w:kern w:val="0"/>
+          <w:sz w:val="48"/>
+          <w:szCs w:val="48"/>
           <w:lang w:eastAsia="es-AR"/>
           <w14:ligatures w14:val="none"/>
         </w:rPr>
@@ -1709,20 +1938,24 @@
         </w:numPr>
         <w:spacing w:after="0" w:line="240" w:lineRule="auto"/>
         <w:rPr>
-          <w:rFonts w:eastAsia="Times New Roman" w:cs="Arial"/>
+          <w:rFonts w:ascii="Arial" w:eastAsia="Times New Roman" w:hAnsi="Arial" w:cs="Arial"/>
           <w:kern w:val="0"/>
+          <w:sz w:val="48"/>
+          <w:szCs w:val="48"/>
           <w:lang w:eastAsia="es-AR"/>
           <w14:ligatures w14:val="none"/>
         </w:rPr>
       </w:pPr>
       <w:r>
         <w:rPr>
-          <w:rFonts w:eastAsia="Times New Roman" w:cs="Arial"/>
+          <w:rFonts w:ascii="Arial" w:eastAsia="Times New Roman" w:hAnsi="Arial" w:cs="Arial"/>
           <w:kern w:val="0"/>
+          <w:sz w:val="48"/>
+          <w:szCs w:val="48"/>
           <w:lang w:eastAsia="es-AR"/>
           <w14:ligatures w14:val="none"/>
         </w:rPr>
-        <w:t xml:space="preserve">LADO A: "100% Divino" </w:t>
+        <w:t xml:space="preserve">LADO A: "100% DIVINO" </w:t>
       </w:r>
     </w:p>
     <w:p>
@@ -1734,28 +1967,34 @@
         </w:numPr>
         <w:spacing w:after="0" w:line="240" w:lineRule="auto"/>
         <w:rPr>
-          <w:rFonts w:eastAsia="Times New Roman" w:cs="Arial"/>
+          <w:rFonts w:ascii="Arial" w:eastAsia="Times New Roman" w:hAnsi="Arial" w:cs="Arial"/>
           <w:kern w:val="0"/>
+          <w:sz w:val="48"/>
+          <w:szCs w:val="48"/>
           <w:lang w:eastAsia="es-AR"/>
           <w14:ligatures w14:val="none"/>
         </w:rPr>
       </w:pPr>
       <w:r>
         <w:rPr>
-          <w:rFonts w:eastAsia="Times New Roman" w:cs="Arial"/>
+          <w:rFonts w:ascii="Arial" w:eastAsia="Times New Roman" w:hAnsi="Arial" w:cs="Arial"/>
           <w:kern w:val="0"/>
+          <w:sz w:val="48"/>
+          <w:szCs w:val="48"/>
           <w:lang w:eastAsia="es-AR"/>
           <w14:ligatures w14:val="none"/>
         </w:rPr>
-        <w:t xml:space="preserve">LADO B: “100% Humano” </w:t>
+        <w:t xml:space="preserve">LADO B: “100% HUMANO” </w:t>
       </w:r>
     </w:p>
     <w:p>
       <w:pPr>
         <w:spacing w:after="0" w:line="240" w:lineRule="auto"/>
         <w:rPr>
-          <w:rFonts w:eastAsia="Times New Roman" w:cs="Arial"/>
+          <w:rFonts w:ascii="Arial" w:eastAsia="Times New Roman" w:hAnsi="Arial" w:cs="Arial"/>
           <w:kern w:val="0"/>
+          <w:sz w:val="48"/>
+          <w:szCs w:val="48"/>
           <w:lang w:eastAsia="es-AR"/>
           <w14:ligatures w14:val="none"/>
         </w:rPr>
@@ -1765,20 +2004,24 @@
       <w:pPr>
         <w:spacing w:after="0" w:line="240" w:lineRule="auto"/>
         <w:rPr>
-          <w:rFonts w:eastAsia="Times New Roman" w:cs="Arial"/>
+          <w:rFonts w:ascii="Arial" w:eastAsia="Times New Roman" w:hAnsi="Arial" w:cs="Arial"/>
           <w:kern w:val="0"/>
+          <w:sz w:val="48"/>
+          <w:szCs w:val="48"/>
           <w:lang w:eastAsia="es-AR"/>
           <w14:ligatures w14:val="none"/>
         </w:rPr>
       </w:pPr>
       <w:r>
         <w:rPr>
-          <w:rFonts w:eastAsia="Times New Roman" w:cs="Arial"/>
+          <w:rFonts w:ascii="Arial" w:eastAsia="Times New Roman" w:hAnsi="Arial" w:cs="Arial"/>
           <w:kern w:val="0"/>
+          <w:sz w:val="48"/>
+          <w:szCs w:val="48"/>
           <w:lang w:eastAsia="es-AR"/>
           <w14:ligatures w14:val="none"/>
         </w:rPr>
-        <w:t>Incluye datos o versículos, imágenes, cuadros, flechas… todo lo que necesites para que se entienda y luzca bien.</w:t>
+        <w:t>INCLUYE DATOS O VERSÍCULOS, IMÁGENES, CUADROS, FLECHAS… TODO LO QUE NECESITES PARA QUE SE ENTIENDA Y LUZCA BIEN.</w:t>
       </w:r>
     </w:p>
     <w:p>
@@ -1787,6 +2030,8 @@
         <w:rPr>
           <w:rFonts w:ascii="Arial" w:eastAsia="Times New Roman" w:hAnsi="Arial" w:cs="Arial"/>
           <w:kern w:val="0"/>
+          <w:sz w:val="48"/>
+          <w:szCs w:val="48"/>
           <w:lang w:eastAsia="es-AR"/>
           <w14:ligatures w14:val="none"/>
         </w:rPr>
@@ -1803,6 +2048,8 @@
         <w:rPr>
           <w:rFonts w:ascii="Arial" w:eastAsia="Times New Roman" w:hAnsi="Arial" w:cs="Arial"/>
           <w:kern w:val="0"/>
+          <w:sz w:val="48"/>
+          <w:szCs w:val="48"/>
           <w:lang w:eastAsia="es-AR"/>
           <w14:ligatures w14:val="none"/>
         </w:rPr>
@@ -1811,10 +2058,12 @@
         <w:rPr>
           <w:rFonts w:ascii="Arial" w:eastAsia="Times New Roman" w:hAnsi="Arial" w:cs="Arial"/>
           <w:kern w:val="0"/>
+          <w:sz w:val="48"/>
+          <w:szCs w:val="48"/>
           <w:lang w:eastAsia="es-AR"/>
           <w14:ligatures w14:val="none"/>
         </w:rPr>
-        <w:t>¿Cómo explicarías de forma clara quién es el Espíritu Santo? ¿Cuál es su misión u obras?</w:t>
+        <w:t>¿CÓMO EXPLICARÍAS DE FORMA CLARA QUIÉN ES EL ESPÍRITU SANTO? ¿CUÁL ES SU MISIÓN U OBRAS?</w:t>
       </w:r>
     </w:p>
     <w:p>
@@ -1824,6 +2073,8 @@
         <w:rPr>
           <w:rFonts w:ascii="Arial" w:eastAsia="Times New Roman" w:hAnsi="Arial" w:cs="Arial"/>
           <w:kern w:val="0"/>
+          <w:sz w:val="48"/>
+          <w:szCs w:val="48"/>
           <w:lang w:eastAsia="es-AR"/>
           <w14:ligatures w14:val="none"/>
         </w:rPr>
@@ -1832,76 +2083,85 @@
     <w:p>
       <w:pPr>
         <w:rPr>
+          <w:rFonts w:ascii="Arial" w:hAnsi="Arial" w:cs="Arial"/>
           <w:b/>
           <w:bCs/>
           <w:noProof/>
-          <w:lang w:val="es-ES"/>
-        </w:rPr>
-      </w:pPr>
-    </w:p>
-    <w:p>
-      <w:pPr>
-        <w:rPr>
-          <w:noProof/>
-          <w:lang w:val="es-ES"/>
-        </w:rPr>
-      </w:pPr>
-      <w:r>
-        <w:rPr>
+          <w:sz w:val="48"/>
+          <w:szCs w:val="48"/>
+          <w:lang w:val="es-ES"/>
+        </w:rPr>
+      </w:pPr>
+    </w:p>
+    <w:p>
+      <w:pPr>
+        <w:rPr>
+          <w:rFonts w:ascii="Arial" w:hAnsi="Arial" w:cs="Arial"/>
+          <w:noProof/>
+          <w:sz w:val="48"/>
+          <w:szCs w:val="48"/>
+          <w:lang w:val="es-ES"/>
+        </w:rPr>
+      </w:pPr>
+      <w:r>
+        <w:rPr>
+          <w:rFonts w:ascii="Arial" w:hAnsi="Arial" w:cs="Arial"/>
           <w:b/>
           <w:bCs/>
           <w:noProof/>
+          <w:sz w:val="48"/>
+          <w:szCs w:val="48"/>
           <w:lang w:val="es-ES"/>
         </w:rPr>
         <w:t>FECHA DE ENTREGA</w:t>
       </w:r>
       <w:r>
         <w:rPr>
-          <w:noProof/>
-          <w:lang w:val="es-ES"/>
-        </w:rPr>
-        <w:t xml:space="preserve">: </w:t>
-      </w:r>
-      <w:r>
-        <w:rPr>
-          <w:noProof/>
-          <w:lang w:val="es-ES"/>
-        </w:rPr>
-        <w:t>4/05</w:t>
-      </w:r>
-    </w:p>
-    <w:p>
-      <w:pPr>
-        <w:rPr>
-          <w:noProof/>
-          <w:lang w:val="es-ES"/>
-        </w:rPr>
-      </w:pPr>
-    </w:p>
-    <w:p>
-      <w:r>
-        <w:rPr>
+          <w:rFonts w:ascii="Arial" w:hAnsi="Arial" w:cs="Arial"/>
+          <w:noProof/>
+          <w:sz w:val="48"/>
+          <w:szCs w:val="48"/>
+          <w:lang w:val="es-ES"/>
+        </w:rPr>
+        <w:t>: 4/05</w:t>
+      </w:r>
+    </w:p>
+    <w:p>
+      <w:pPr>
+        <w:rPr>
+          <w:rFonts w:ascii="Arial" w:hAnsi="Arial" w:cs="Arial"/>
+          <w:noProof/>
+          <w:sz w:val="48"/>
+          <w:szCs w:val="48"/>
+          <w:lang w:val="es-ES"/>
+        </w:rPr>
+      </w:pPr>
+    </w:p>
+    <w:p>
+      <w:pPr>
+        <w:rPr>
+          <w:rFonts w:ascii="Arial" w:hAnsi="Arial" w:cs="Arial"/>
+          <w:sz w:val="48"/>
+          <w:szCs w:val="48"/>
+        </w:rPr>
+      </w:pPr>
+      <w:r>
+        <w:rPr>
+          <w:rFonts w:ascii="Arial" w:hAnsi="Arial" w:cs="Arial"/>
           <w:b/>
           <w:bCs/>
           <w:noProof/>
-          <w:lang w:val="es-ES"/>
-        </w:rPr>
-        <w:t>CALIFICACI</w:t>
-      </w:r>
-      <w:r>
-        <w:rPr>
-          <w:b/>
-          <w:bCs/>
-          <w:noProof/>
-          <w:lang w:val="es-ES"/>
-        </w:rPr>
-        <w:t>ÓN:</w:t>
+          <w:sz w:val="48"/>
+          <w:szCs w:val="48"/>
+          <w:lang w:val="es-ES"/>
+        </w:rPr>
+        <w:t>CALIFICACIÓN:</w:t>
       </w:r>
     </w:p>
     <w:sectPr>
-      <w:headerReference w:type="default" r:id="rId7"/>
-      <w:pgSz w:w="11906" w:h="16838"/>
-      <w:pgMar w:top="1134" w:right="991" w:bottom="709" w:left="851" w:header="708" w:footer="708" w:gutter="0"/>
+      <w:headerReference w:type="default" r:id="rId8"/>
+      <w:pgSz w:w="12240" w:h="20160" w:code="5"/>
+      <w:pgMar w:top="720" w:right="720" w:bottom="426" w:left="720" w:header="708" w:footer="708" w:gutter="0"/>
       <w:cols w:space="708"/>
       <w:docGrid w:linePitch="360"/>
     </w:sectPr>
@@ -1989,7 +2249,7 @@
               <wp:lineTo x="0" y="0"/>
             </wp:wrapPolygon>
           </wp:wrapTight>
-          <wp:docPr id="2111088182" name="Imagen 1" descr="Instituto Adventista Formosa | Educación Adventista"/>
+          <wp:docPr id="1858552562" name="Imagen 1" descr="Instituto Adventista Formosa | Educación Adventista"/>
           <wp:cNvGraphicFramePr>
             <a:graphicFrameLocks xmlns:a="http://schemas.openxmlformats.org/drawingml/2006/main" noChangeAspect="1"/>
           </wp:cNvGraphicFramePr>
@@ -2980,6 +3240,7 @@
   <w:style w:type="character" w:default="1" w:styleId="Fuentedeprrafopredeter">
     <w:name w:val="Default Paragraph Font"/>
     <w:uiPriority w:val="1"/>
+    <w:semiHidden/>
     <w:unhideWhenUsed/>
   </w:style>
   <w:style w:type="table" w:default="1" w:styleId="Tablanormal">
@@ -3664,4 +3925,16 @@
     </a:ext>
   </a:extLst>
 </a:theme>
+</file>
+
+<file path=customXml/item1.xml><?xml version="1.0" encoding="utf-8"?>
+<b:Sources xmlns:b="http://schemas.openxmlformats.org/officeDocument/2006/bibliography" xmlns="http://schemas.openxmlformats.org/officeDocument/2006/bibliography" SelectedStyle="\APASixthEditionOfficeOnline.xsl" StyleName="APA" Version="6"/>
+</file>
+
+<file path=customXml/itemProps1.xml><?xml version="1.0" encoding="utf-8"?>
+<ds:datastoreItem xmlns:ds="http://schemas.openxmlformats.org/officeDocument/2006/customXml" ds:itemID="{427D5188-42F1-409F-A9DD-587F63C25D54}">
+  <ds:schemaRefs>
+    <ds:schemaRef ds:uri="http://schemas.openxmlformats.org/officeDocument/2006/bibliography"/>
+  </ds:schemaRefs>
+</ds:datastoreItem>
 </file>
</xml_diff>